<commit_message>
RTpred: second concept figures adapted from CC BY papers
Three figures redrawn in the portal style from open-licence papers (licences
checked in Europe PMC; Retip and RepoRT carry none, so they are not used):
- pipeline: predicted RT in metabolite annotation, from Sille et al., Front
  Public Health 2025, Fig. 1, without its calibration step (RTpred has none);
- rtpred_predict: ranking same-m/z candidates by predicted RT error, from
  Domingo-Almenara et al., Nat Commun 2019, Fig. 4;
- rtpred_train: molecular representations, with RTpred's RDKit descriptor
  path highlighted, from Liu et al., J Cheminform 2024, Fig. 4, without the
  model timeline.
Each is added as figure 2 next to our own concept figure, with full source
lines (all authors, DOI, Fig. N modified, CC BY 4.0). Word files, portal
images (concept_2) and the 2026-10-23 release folder (not yet deployed)
rebuilt; release scripts unchanged.

Co-Authored-By: Claude Opus 5.5 <noreply@anthropic.com>
</commit_message>
<xml_diff>
--- a/docs/RTpred/pipeline/Portal_Content.docx
+++ b/docs/RTpred/pipeline/Portal_Content.docx
@@ -1628,6 +1628,225 @@
     </w:p>
     <w:p>
       <w:pPr>
+        <w:spacing w:after="120"/>
+      </w:pPr>
+      <w:r>
+        <w:rPr>
+          <w:b/>
+          <w:bCs/>
+          <w:color w:val="B0B0B0"/>
+          <w:sz w:val="18"/>
+          <w:szCs w:val="18"/>
+        </w:rPr>
+        <w:t xml:space="preserve">[내부 메모 · 붙여 넣지 마세요] </w:t>
+      </w:r>
+      <w:r>
+        <w:rPr>
+          <w:color w:val="8A8F99"/>
+          <w:sz w:val="18"/>
+          <w:szCs w:val="18"/>
+        </w:rPr>
+        <w:t xml:space="preserve">그림: </w:t>
+      </w:r>
+      <w:r>
+        <w:rPr>
+          <w:color w:val="8A8F99"/>
+          <w:sz w:val="18"/>
+          <w:szCs w:val="18"/>
+        </w:rPr>
+        <w:t xml:space="preserve">docs/RTpred/modules/figures/module_concepts/rtpred_annotation_use_concept.png</w:t>
+      </w:r>
+      <w:r>
+        <w:rPr>
+          <w:color w:val="8A8F99"/>
+          <w:sz w:val="18"/>
+          <w:szCs w:val="18"/>
+        </w:rPr>
+        <w:t xml:space="preserve"> (그림 2)</w:t>
+      </w:r>
+    </w:p>
+    <w:p>
+      <w:pPr>
+        <w:spacing w:after="120" w:before="120"/>
+        <w:jc w:val="center"/>
+      </w:pPr>
+      <w:r>
+        <w:drawing>
+          <wp:inline distT="0" distB="0" distL="0" distR="0">
+            <wp:extent cx="5715000" cy="2362200"/>
+            <wp:effectExtent t="0" r="0" b="0" l="0"/>
+            <wp:docPr id="4" name="" descr="" title=""/>
+            <wp:cNvGraphicFramePr>
+              <a:graphicFrameLocks xmlns:a="http://schemas.openxmlformats.org/drawingml/2006/main" noChangeAspect="1"/>
+            </wp:cNvGraphicFramePr>
+            <a:graphic xmlns:a="http://schemas.openxmlformats.org/drawingml/2006/main">
+              <a:graphicData uri="http://schemas.openxmlformats.org/drawingml/2006/picture">
+                <pic:pic xmlns:pic="http://schemas.openxmlformats.org/drawingml/2006/picture">
+                  <pic:nvPicPr>
+                    <pic:cNvPr id="0" name="" descr=""/>
+                    <pic:cNvPicPr>
+                      <a:picLocks noChangeAspect="1" noChangeArrowheads="1"/>
+                    </pic:cNvPicPr>
+                  </pic:nvPicPr>
+                  <pic:blipFill>
+                    <a:blip r:embed="rId10" cstate="none"/>
+                    <a:srcRect/>
+                    <a:stretch>
+                      <a:fillRect/>
+                    </a:stretch>
+                  </pic:blipFill>
+                  <pic:spPr bwMode="auto">
+                    <a:xfrm>
+                      <a:off x="0" y="0"/>
+                      <a:ext cx="5715000" cy="2362200"/>
+                    </a:xfrm>
+                    <a:prstGeom prst="rect">
+                      <a:avLst/>
+                    </a:prstGeom>
+                  </pic:spPr>
+                </pic:pic>
+              </a:graphicData>
+            </a:graphic>
+          </wp:inline>
+        </w:drawing>
+      </w:r>
+    </w:p>
+    <w:p>
+      <w:pPr>
+        <w:spacing w:after="100" w:before="200"/>
+      </w:pPr>
+      <w:r>
+        <w:rPr>
+          <w:b/>
+          <w:bCs/>
+          <w:color w:val="3A3A3A"/>
+          <w:sz w:val="24"/>
+          <w:szCs w:val="24"/>
+        </w:rPr>
+        <w:t xml:space="preserve">국문 (그림 2 설명)</w:t>
+      </w:r>
+    </w:p>
+    <w:p>
+      <w:pPr>
+        <w:spacing w:after="140"/>
+      </w:pPr>
+      <w:r>
+        <w:rPr>
+          <w:b/>
+          <w:bCs/>
+        </w:rPr>
+        <w:t xml:space="preserve">그림 2. 예측 머무름 시간을 대사체 annotation에 쓰는 흐름.</w:t>
+      </w:r>
+      <w:r>
+        <w:t xml:space="preserve"> (1) LC-MS에서 피크 하나의 m/z와 측정 RT를 얻습니다. (2) 같은 m/z를 가진 후보 구조를 데이터베이스에서 찾습니다. (3) RTpred가 후보마다 RT를 예측합니다. 모델은 미리 측정 RT 자료로 학습해 둔 것으로, 사전 학습 RP·HILIC 모델 또는 rtpred_train으로 만든 사용자 모델입니다. (4) 측정 RT와 예측 RT의 차이(ΔRT)로 후보 순위를 매깁니다. (5) ΔRT가 작은 후보를 m/z, MS/MS 증거와 함께 annotation에 씁니다. 값은 모식적인 값입니다. Sillé 외, Front Public Health 2025, Fig. 1을 수정(CC BY 4.0). 원 그림의 RT 보정(calibration, projection) 단계는 RTpred에 없어 뺐습니다.</w:t>
+      </w:r>
+    </w:p>
+    <w:p>
+      <w:pPr>
+        <w:spacing w:after="100" w:before="200"/>
+      </w:pPr>
+      <w:r>
+        <w:rPr>
+          <w:b/>
+          <w:bCs/>
+          <w:color w:val="3A3A3A"/>
+          <w:sz w:val="24"/>
+          <w:szCs w:val="24"/>
+        </w:rPr>
+        <w:t xml:space="preserve">English (figure 2 legend)</w:t>
+      </w:r>
+    </w:p>
+    <w:p>
+      <w:pPr>
+        <w:spacing w:after="140"/>
+      </w:pPr>
+      <w:r>
+        <w:rPr>
+          <w:b/>
+          <w:bCs/>
+        </w:rPr>
+        <w:t xml:space="preserve">Figure 2. Using predicted retention times in metabolite annotation.</w:t>
+      </w:r>
+      <w:r>
+        <w:t xml:space="preserve"> (1) LC-MS gives the m/z and measured RT of a peak. (2) Candidate structures with the same m/z are taken from a database. (3) RTpred predicts the RT of each candidate with a model trained beforehand on measured RTs: the pre-trained RP or HILIC model, or a user model built with rtpred_train. (4) Candidates are ranked by the difference between measured and predicted RT (ΔRT). (5) Candidates with a small ΔRT are annotated together with m/z and MS/MS evidence. Values are schematic. Adapted from Sillé et al., Front Public Health 2025, Fig. 1 (CC BY 4.0); the RT calibration (projection) step of the original is left out because RTpred has none.</w:t>
+      </w:r>
+    </w:p>
+    <w:p>
+      <w:pPr>
+        <w:spacing w:after="100" w:before="200"/>
+      </w:pPr>
+      <w:r>
+        <w:rPr>
+          <w:b/>
+          <w:bCs/>
+          <w:color w:val="3A3A3A"/>
+          <w:sz w:val="24"/>
+          <w:szCs w:val="24"/>
+        </w:rPr>
+        <w:t xml:space="preserve">대체 텍스트 (그림 2)</w:t>
+      </w:r>
+    </w:p>
+    <w:p>
+      <w:pPr>
+        <w:pStyle w:val="ListParagraph"/>
+        <w:numPr>
+          <w:ilvl w:val="0"/>
+          <w:numId w:val="2"/>
+        </w:numPr>
+        <w:spacing w:after="80"/>
+      </w:pPr>
+      <w:r>
+        <w:t xml:space="preserve">국문: LC-MS 피크, 같은 m/z 후보, RTpred 예측, ΔRT 순위, annotation으로 이어지는 다섯 단계 흐름도.</w:t>
+      </w:r>
+    </w:p>
+    <w:p>
+      <w:pPr>
+        <w:pStyle w:val="ListParagraph"/>
+        <w:numPr>
+          <w:ilvl w:val="0"/>
+          <w:numId w:val="2"/>
+        </w:numPr>
+        <w:spacing w:after="80"/>
+      </w:pPr>
+      <w:r>
+        <w:t xml:space="preserve">English: Five-step flow: LC-MS peak, candidates with the same m/z, RTpred prediction, ranking by ΔRT, annotation.</w:t>
+      </w:r>
+    </w:p>
+    <w:p>
+      <w:pPr>
+        <w:spacing w:after="100" w:before="200"/>
+      </w:pPr>
+      <w:r>
+        <w:rPr>
+          <w:b/>
+          <w:bCs/>
+          <w:color w:val="3A3A3A"/>
+          <w:sz w:val="24"/>
+          <w:szCs w:val="24"/>
+        </w:rPr>
+        <w:t xml:space="preserve">출처 (그림 2)</w:t>
+      </w:r>
+    </w:p>
+    <w:p>
+      <w:pPr>
+        <w:spacing w:after="140"/>
+      </w:pPr>
+      <w:r>
+        <w:t xml:space="preserve">Sillé FCM, Prasse C, Luechtefeld T, Hartung T. AI redefines mass spectrometry chemicals identification: retention time prediction in metabolomics and for a Human Exposome Project. </w:t>
+      </w:r>
+      <w:r>
+        <w:rPr>
+          <w:i/>
+          <w:iCs/>
+        </w:rPr>
+        <w:t xml:space="preserve">Front Public Health</w:t>
+      </w:r>
+      <w:r>
+        <w:t xml:space="preserve"> 13, 1687056 (2025). https://doi.org/10.3389/fpubh.2025.1687056, Fig. 1을 수정. CC BY 4.0 (https://creativecommons.org/licenses/by/4.0/).</w:t>
+      </w:r>
+    </w:p>
+    <w:p>
+      <w:pPr>
         <w:pBdr>
           <w:bottom w:val="single" w:color="32549C" w:sz="8" w:space="4"/>
         </w:pBdr>

</xml_diff>

<commit_message>
RTpred: principle figures instead of result-like ones
The figures adapted from METLIN (candidate ranking with named compounds and
errors) and Sille et al. (ΔRT ranking table) looked like results RTpred
does not produce, so they are taken out of the docs and portal images.
Added instead, redrawn from Xie et al., J Pharm Anal 2025 (CC BY 4.0):
- pipeline figure 2: the QSRR principle (measured RTs and structures,
  descriptors, training, validation, prediction) with the RTpred module of
  each step (Fig. 1);
- rtpred_train figure 3: one model per chromatographic condition, why RP
  and HILIC get separate models (Fig. 7A, model-based part left out).
The Liu et al. representation figure stays. Word files, portal images (zip
holds only the figures in the docs) and the 2026-10-23 release folder
(not yet deployed) rebuilt; release scripts unchanged.

Co-Authored-By: Claude Opus 5.5 <noreply@anthropic.com>
</commit_message>
<xml_diff>
--- a/docs/RTpred/pipeline/Portal_Content.docx
+++ b/docs/RTpred/pipeline/Portal_Content.docx
@@ -1654,15 +1654,31 @@
           <w:sz w:val="18"/>
           <w:szCs w:val="18"/>
         </w:rPr>
-        <w:t xml:space="preserve">docs/RTpred/modules/figures/module_concepts/rtpred_annotation_use_concept.png</w:t>
-      </w:r>
-      <w:r>
-        <w:rPr>
-          <w:color w:val="8A8F99"/>
-          <w:sz w:val="18"/>
-          <w:szCs w:val="18"/>
-        </w:rPr>
-        <w:t xml:space="preserve"> (그림 2)</w:t>
+        <w:t xml:space="preserve">docs/RTpred/pipeline/figures/concept_2.png</w:t>
+      </w:r>
+      <w:r>
+        <w:rPr>
+          <w:color w:val="8A8F99"/>
+          <w:sz w:val="18"/>
+          <w:szCs w:val="18"/>
+        </w:rPr>
+        <w:t xml:space="preserve"> (그림 2, 원본 </w:t>
+      </w:r>
+      <w:r>
+        <w:rPr>
+          <w:color w:val="8A8F99"/>
+          <w:sz w:val="18"/>
+          <w:szCs w:val="18"/>
+        </w:rPr>
+        <w:t xml:space="preserve">concept_2.svg</w:t>
+      </w:r>
+      <w:r>
+        <w:rPr>
+          <w:color w:val="8A8F99"/>
+          <w:sz w:val="18"/>
+          <w:szCs w:val="18"/>
+        </w:rPr>
+        <w:t xml:space="preserve">)</w:t>
       </w:r>
     </w:p>
     <w:p>
@@ -1735,10 +1751,10 @@
           <w:b/>
           <w:bCs/>
         </w:rPr>
-        <w:t xml:space="preserve">그림 2. 예측 머무름 시간을 대사체 annotation에 쓰는 흐름.</w:t>
-      </w:r>
-      <w:r>
-        <w:t xml:space="preserve"> (1) LC-MS에서 피크 하나의 m/z와 측정 RT를 얻습니다. (2) 같은 m/z를 가진 후보 구조를 데이터베이스에서 찾습니다. (3) RTpred가 후보마다 RT를 예측합니다. 모델은 미리 측정 RT 자료로 학습해 둔 것으로, 사전 학습 RP·HILIC 모델 또는 rtpred_train으로 만든 사용자 모델입니다. (4) 측정 RT와 예측 RT의 차이(ΔRT)로 후보 순위를 매깁니다. (5) ΔRT가 작은 후보를 m/z, MS/MS 증거와 함께 annotation에 씁니다. 값은 모식적인 값입니다. Sillé 외, Front Public Health 2025, Fig. 1을 수정(CC BY 4.0). 원 그림의 RT 보정(calibration, projection) 단계는 RTpred에 없어 뺐습니다.</w:t>
+        <w:t xml:space="preserve">그림 2. 구조로 머무름 시간을 예측하는 원리(QSRR).</w:t>
+      </w:r>
+      <w:r>
+        <w:t xml:space="preserve"> (A) 구조를 아는 화합물들의 측정 RT를 모읍니다. (B) 구조(SMILES)를 RDKit descriptor(logP, TPSA, 수소결합 받개 수 등)로 바꿉니다. (C) descriptor와 측정 RT의 관계를 머신러닝 모델로 학습하고, (D) 학습에 쓰지 않은 자료로 검증합니다. (E) 학습한 모델이 새 구조의 RT를 예측합니다. RTpred의 rtpred_train이 A~D를(AutoGluon, 모드마다 모델 하나), rtpred_predict가 E를, rtpred_compare가 떼어 둔 자료로 D와 E를 맡으며, 이미지의 사전 학습 모델도 같은 방식으로 만들었습니다. 모식도입니다. Xie 외, J Pharm Anal 2025, Fig. 1을 수정(CC BY 4.0).</w:t>
       </w:r>
     </w:p>
     <w:p>
@@ -1765,10 +1781,10 @@
           <w:b/>
           <w:bCs/>
         </w:rPr>
-        <w:t xml:space="preserve">Figure 2. Using predicted retention times in metabolite annotation.</w:t>
-      </w:r>
-      <w:r>
-        <w:t xml:space="preserve"> (1) LC-MS gives the m/z and measured RT of a peak. (2) Candidate structures with the same m/z are taken from a database. (3) RTpred predicts the RT of each candidate with a model trained beforehand on measured RTs: the pre-trained RP or HILIC model, or a user model built with rtpred_train. (4) Candidates are ranked by the difference between measured and predicted RT (ΔRT). (5) Candidates with a small ΔRT are annotated together with m/z and MS/MS evidence. Values are schematic. Adapted from Sillé et al., Front Public Health 2025, Fig. 1 (CC BY 4.0); the RT calibration (projection) step of the original is left out because RTpred has none.</w:t>
+        <w:t xml:space="preserve">Figure 2. The principle of predicting retention time from structure (QSRR).</w:t>
+      </w:r>
+      <w:r>
+        <w:t xml:space="preserve"> (A) Measured RTs of compounds with known structures are collected. (B) Structures (SMILES) are turned into RDKit descriptors (logP, TPSA, hydrogen-bond acceptors and so on). (C) A machine learning model learns the relation between descriptors and measured RT and (D) is validated on data not used for training. (E) The trained model predicts the RT of new structures. In RTpred, rtpred_train covers A-D (AutoGluon, one model per mode), rtpred_predict covers E, and rtpred_compare covers D and E on held-out data; the pre-trained models in the image were built the same way. Schematic. Adapted from Xie et al., J Pharm Anal 2025, Fig. 1 (CC BY 4.0).</w:t>
       </w:r>
     </w:p>
     <w:p>
@@ -1796,7 +1812,7 @@
         <w:spacing w:after="80"/>
       </w:pPr>
       <w:r>
-        <w:t xml:space="preserve">국문: LC-MS 피크, 같은 m/z 후보, RTpred 예측, ΔRT 순위, annotation으로 이어지는 다섯 단계 흐름도.</w:t>
+        <w:t xml:space="preserve">국문: QSRR 원리 흐름도. 측정 RT와 구조, 분자 descriptor, 모델 학습, 검증, RT 예측의 다섯 단계와 각 단계를 맡는 RTpred 모듈.</w:t>
       </w:r>
     </w:p>
     <w:p>
@@ -1809,7 +1825,7 @@
         <w:spacing w:after="80"/>
       </w:pPr>
       <w:r>
-        <w:t xml:space="preserve">English: Five-step flow: LC-MS peak, candidates with the same m/z, RTpred prediction, ranking by ΔRT, annotation.</w:t>
+        <w:t xml:space="preserve">English: QSRR principle: measured RTs and structures, molecular descriptors, model training, validation and RT prediction, with the RTpred module for each step.</w:t>
       </w:r>
     </w:p>
     <w:p>
@@ -1832,17 +1848,17 @@
         <w:spacing w:after="140"/>
       </w:pPr>
       <w:r>
-        <w:t xml:space="preserve">Sillé FCM, Prasse C, Luechtefeld T, Hartung T. AI redefines mass spectrometry chemicals identification: retention time prediction in metabolomics and for a Human Exposome Project. </w:t>
+        <w:t xml:space="preserve">Xie J, Chen S, Zhao L, Dong X. Application of artificial intelligence to quantitative structure-retention relationship calculations in chromatography. </w:t>
       </w:r>
       <w:r>
         <w:rPr>
           <w:i/>
           <w:iCs/>
         </w:rPr>
-        <w:t xml:space="preserve">Front Public Health</w:t>
-      </w:r>
-      <w:r>
-        <w:t xml:space="preserve"> 13, 1687056 (2025). https://doi.org/10.3389/fpubh.2025.1687056, Fig. 1을 수정. CC BY 4.0 (https://creativecommons.org/licenses/by/4.0/).</w:t>
+        <w:t xml:space="preserve">J Pharm Anal</w:t>
+      </w:r>
+      <w:r>
+        <w:t xml:space="preserve"> 15, 101155 (2025). https://doi.org/10.1016/j.jpha.2024.101155, Fig. 1을 수정. CC BY 4.0 (https://creativecommons.org/licenses/by/4.0/).</w:t>
       </w:r>
     </w:p>
     <w:p>

</xml_diff>

<commit_message>
RTpred docs: one pipeline named RTpred; train keeps two concept figures
The pipeline content is registered as one pipeline, RTpred (rtpred_train ->
rtpred_predict, rtpred_train -> rtpred_compare), instead of the two
proposed ones: one registration table, a merged introduction, one metro map
(pipeline.png, rtpred_predict also runs with the pre-trained models alone)
and a first key note on running rtpred_predict alone without training
data. Registration follows. The Liu et al. representation figure is taken
out of rtpred_train (it shows representations RTpred does not use); the
per-condition figure becomes figure 2. Word files, portal images and the
2026-10-23 release folder (not yet deployed) rebuilt; release scripts
unchanged.

Co-Authored-By: Claude Opus 5.5 <noreply@anthropic.com>
</commit_message>
<xml_diff>
--- a/docs/RTpred/pipeline/Portal_Content.docx
+++ b/docs/RTpred/pipeline/Portal_Content.docx
@@ -38,7 +38,23 @@
           <w:sz w:val="18"/>
           <w:szCs w:val="18"/>
         </w:rPr>
-        <w:t xml:space="preserve">KOBIC 포탈의 RTpred 파이프라인 상세 페이지에 들어갈 국문/영문 원고입니다. 서울대 식품대사체학 연구실의 답변(2026-10-21)에 따라 두 파이프라인(기본 모델 예측, 사용자 모델)으로 등록하는 것을 제안합니다. 모듈별 입력·옵션·결과는 </w:t>
+        <w:t xml:space="preserve">KOBIC 포탈의 RTpred 파이프라인 상세 페이지에 들어갈 국문/영문 원고입니다. CLOSHA에는 서울대가 제안한 이름 그대로 </w:t>
+      </w:r>
+      <w:r>
+        <w:rPr>
+          <w:color w:val="8A8F99"/>
+          <w:sz w:val="18"/>
+          <w:szCs w:val="18"/>
+        </w:rPr>
+        <w:t xml:space="preserve">RTpred</w:t>
+      </w:r>
+      <w:r>
+        <w:rPr>
+          <w:color w:val="8A8F99"/>
+          <w:sz w:val="18"/>
+          <w:szCs w:val="18"/>
+        </w:rPr>
+        <w:t xml:space="preserve"> 파이프라인 하나로 등록합니다(rtpred_train → rtpred_predict, rtpred_train → rtpred_compare). 학습 자료가 없는 사용자는 rtpred_predict 모듈만 단독으로 실행해 사전 학습 모델로 예측합니다. 모듈별 입력·옵션·결과는 </w:t>
       </w:r>
       <w:r>
         <w:rPr>
@@ -160,14 +176,13 @@
         </w:tblBorders>
       </w:tblPr>
       <w:tblGrid>
-        <w:gridCol w:w="1800"/>
-        <w:gridCol w:w="3853"/>
-        <w:gridCol w:w="3853"/>
+        <w:gridCol w:w="4753"/>
+        <w:gridCol w:w="4753"/>
       </w:tblGrid>
       <w:tr>
         <w:tc>
           <w:tcPr>
-            <w:tcW w:type="dxa" w:w="1800"/>
+            <w:tcW w:type="dxa" w:w="4753"/>
             <w:shd w:fill="E8EDF6" w:color="auto" w:val="clear"/>
             <w:tcMar>
               <w:top w:type="dxa" w:w="60"/>
@@ -191,7 +206,7 @@
         </w:tc>
         <w:tc>
           <w:tcPr>
-            <w:tcW w:type="dxa" w:w="3853"/>
+            <w:tcW w:type="dxa" w:w="4753"/>
             <w:shd w:fill="E8EDF6" w:color="auto" w:val="clear"/>
             <w:tcMar>
               <w:top w:type="dxa" w:w="60"/>
@@ -209,31 +224,7 @@
                 <w:sz w:val="18"/>
                 <w:szCs w:val="18"/>
               </w:rPr>
-              <w:t xml:space="preserve">기본 모델 예측</w:t>
-            </w:r>
-          </w:p>
-        </w:tc>
-        <w:tc>
-          <w:tcPr>
-            <w:tcW w:type="dxa" w:w="3853"/>
-            <w:shd w:fill="E8EDF6" w:color="auto" w:val="clear"/>
-            <w:tcMar>
-              <w:top w:type="dxa" w:w="60"/>
-              <w:left w:type="dxa" w:w="90"/>
-              <w:bottom w:type="dxa" w:w="60"/>
-              <w:right w:type="dxa" w:w="90"/>
-            </w:tcMar>
-          </w:tcPr>
-          <w:p>
-            <w:r>
-              <w:rPr>
-                <w:b/>
-                <w:bCs/>
-                <w:color w:val="32549C"/>
-                <w:sz w:val="18"/>
-                <w:szCs w:val="18"/>
-              </w:rPr>
-              <w:t xml:space="preserve">사용자 모델</w:t>
+              <w:t xml:space="preserve">값</w:t>
             </w:r>
           </w:p>
         </w:tc>
@@ -241,7 +232,7 @@
       <w:tr>
         <w:tc>
           <w:tcPr>
-            <w:tcW w:type="dxa" w:w="1800"/>
+            <w:tcW w:type="dxa" w:w="4753"/>
             <w:tcMar>
               <w:top w:type="dxa" w:w="60"/>
               <w:left w:type="dxa" w:w="90"/>
@@ -261,7 +252,7 @@
         </w:tc>
         <w:tc>
           <w:tcPr>
-            <w:tcW w:type="dxa" w:w="3853"/>
+            <w:tcW w:type="dxa" w:w="4753"/>
             <w:tcMar>
               <w:top w:type="dxa" w:w="60"/>
               <w:left w:type="dxa" w:w="90"/>
@@ -275,27 +266,7 @@
                 <w:sz w:val="18"/>
                 <w:szCs w:val="18"/>
               </w:rPr>
-              <w:t xml:space="preserve">RTpred_Default_Prediction</w:t>
-            </w:r>
-          </w:p>
-        </w:tc>
-        <w:tc>
-          <w:tcPr>
-            <w:tcW w:type="dxa" w:w="3853"/>
-            <w:tcMar>
-              <w:top w:type="dxa" w:w="60"/>
-              <w:left w:type="dxa" w:w="90"/>
-              <w:bottom w:type="dxa" w:w="60"/>
-              <w:right w:type="dxa" w:w="90"/>
-            </w:tcMar>
-          </w:tcPr>
-          <w:p>
-            <w:r>
-              <w:rPr>
-                <w:sz w:val="18"/>
-                <w:szCs w:val="18"/>
-              </w:rPr>
-              <w:t xml:space="preserve">RTpred_User_Model</w:t>
+              <w:t xml:space="preserve">RTpred</w:t>
             </w:r>
           </w:p>
         </w:tc>
@@ -303,7 +274,7 @@
       <w:tr>
         <w:tc>
           <w:tcPr>
-            <w:tcW w:type="dxa" w:w="1800"/>
+            <w:tcW w:type="dxa" w:w="4753"/>
             <w:tcMar>
               <w:top w:type="dxa" w:w="60"/>
               <w:left w:type="dxa" w:w="90"/>
@@ -323,27 +294,7 @@
         </w:tc>
         <w:tc>
           <w:tcPr>
-            <w:tcW w:type="dxa" w:w="3853"/>
-            <w:tcMar>
-              <w:top w:type="dxa" w:w="60"/>
-              <w:left w:type="dxa" w:w="90"/>
-              <w:bottom w:type="dxa" w:w="60"/>
-              <w:right w:type="dxa" w:w="90"/>
-            </w:tcMar>
-          </w:tcPr>
-          <w:p>
-            <w:r>
-              <w:rPr>
-                <w:sz w:val="18"/>
-                <w:szCs w:val="18"/>
-              </w:rPr>
-              <w:t xml:space="preserve">rtpred_predict</w:t>
-            </w:r>
-          </w:p>
-        </w:tc>
-        <w:tc>
-          <w:tcPr>
-            <w:tcW w:type="dxa" w:w="3853"/>
+            <w:tcW w:type="dxa" w:w="4753"/>
             <w:tcMar>
               <w:top w:type="dxa" w:w="60"/>
               <w:left w:type="dxa" w:w="90"/>
@@ -365,7 +316,7 @@
       <w:tr>
         <w:tc>
           <w:tcPr>
-            <w:tcW w:type="dxa" w:w="1800"/>
+            <w:tcW w:type="dxa" w:w="4753"/>
             <w:tcMar>
               <w:top w:type="dxa" w:w="60"/>
               <w:left w:type="dxa" w:w="90"/>
@@ -385,27 +336,7 @@
         </w:tc>
         <w:tc>
           <w:tcPr>
-            <w:tcW w:type="dxa" w:w="3853"/>
-            <w:tcMar>
-              <w:top w:type="dxa" w:w="60"/>
-              <w:left w:type="dxa" w:w="90"/>
-              <w:bottom w:type="dxa" w:w="60"/>
-              <w:right w:type="dxa" w:w="90"/>
-            </w:tcMar>
-          </w:tcPr>
-          <w:p>
-            <w:r>
-              <w:rPr>
-                <w:sz w:val="18"/>
-                <w:szCs w:val="18"/>
-              </w:rPr>
-              <w:t xml:space="preserve">1.0 (CLOSHA 3.0 첫 배포)</w:t>
-            </w:r>
-          </w:p>
-        </w:tc>
-        <w:tc>
-          <w:tcPr>
-            <w:tcW w:type="dxa" w:w="3853"/>
+            <w:tcW w:type="dxa" w:w="4753"/>
             <w:tcMar>
               <w:top w:type="dxa" w:w="60"/>
               <w:left w:type="dxa" w:w="90"/>
@@ -427,7 +358,7 @@
       <w:tr>
         <w:tc>
           <w:tcPr>
-            <w:tcW w:type="dxa" w:w="1800"/>
+            <w:tcW w:type="dxa" w:w="4753"/>
             <w:tcMar>
               <w:top w:type="dxa" w:w="60"/>
               <w:left w:type="dxa" w:w="90"/>
@@ -447,27 +378,7 @@
         </w:tc>
         <w:tc>
           <w:tcPr>
-            <w:tcW w:type="dxa" w:w="3853"/>
-            <w:tcMar>
-              <w:top w:type="dxa" w:w="60"/>
-              <w:left w:type="dxa" w:w="90"/>
-              <w:bottom w:type="dxa" w:w="60"/>
-              <w:right w:type="dxa" w:w="90"/>
-            </w:tcMar>
-          </w:tcPr>
-          <w:p>
-            <w:r>
-              <w:rPr>
-                <w:sz w:val="18"/>
-                <w:szCs w:val="18"/>
-              </w:rPr>
-              <w:t xml:space="preserve">https://doi.org/10.1021/acs.analchem.9b05765</w:t>
-            </w:r>
-          </w:p>
-        </w:tc>
-        <w:tc>
-          <w:tcPr>
-            <w:tcW w:type="dxa" w:w="3853"/>
+            <w:tcW w:type="dxa" w:w="4753"/>
             <w:tcMar>
               <w:top w:type="dxa" w:w="60"/>
               <w:left w:type="dxa" w:w="90"/>
@@ -489,7 +400,7 @@
       <w:tr>
         <w:tc>
           <w:tcPr>
-            <w:tcW w:type="dxa" w:w="1800"/>
+            <w:tcW w:type="dxa" w:w="4753"/>
             <w:tcMar>
               <w:top w:type="dxa" w:w="60"/>
               <w:left w:type="dxa" w:w="90"/>
@@ -509,7 +420,7 @@
         </w:tc>
         <w:tc>
           <w:tcPr>
-            <w:tcW w:type="dxa" w:w="3853"/>
+            <w:tcW w:type="dxa" w:w="4753"/>
             <w:tcMar>
               <w:top w:type="dxa" w:w="60"/>
               <w:left w:type="dxa" w:w="90"/>
@@ -523,27 +434,7 @@
                 <w:sz w:val="18"/>
                 <w:szCs w:val="18"/>
               </w:rPr>
-              <w:t xml:space="preserve">retention time prediction, metabolomics, untargeted metabolomics, metabolite annotation, LC-MS, reversed phase, HILIC, machine learning, cheminformatics</w:t>
-            </w:r>
-          </w:p>
-        </w:tc>
-        <w:tc>
-          <w:tcPr>
-            <w:tcW w:type="dxa" w:w="3853"/>
-            <w:tcMar>
-              <w:top w:type="dxa" w:w="60"/>
-              <w:left w:type="dxa" w:w="90"/>
-              <w:bottom w:type="dxa" w:w="60"/>
-              <w:right w:type="dxa" w:w="90"/>
-            </w:tcMar>
-          </w:tcPr>
-          <w:p>
-            <w:r>
-              <w:rPr>
-                <w:sz w:val="18"/>
-                <w:szCs w:val="18"/>
-              </w:rPr>
-              <w:t xml:space="preserve">같음 + model training, model comparison</w:t>
+              <w:t xml:space="preserve">retention time prediction, metabolomics, untargeted metabolomics, metabolite annotation, LC-MS, reversed phase, HILIC, model training, model comparison, machine learning, cheminformatics</w:t>
             </w:r>
           </w:p>
         </w:tc>
@@ -551,7 +442,7 @@
       <w:tr>
         <w:tc>
           <w:tcPr>
-            <w:tcW w:type="dxa" w:w="1800"/>
+            <w:tcW w:type="dxa" w:w="4753"/>
             <w:tcMar>
               <w:top w:type="dxa" w:w="60"/>
               <w:left w:type="dxa" w:w="90"/>
@@ -571,7 +462,7 @@
         </w:tc>
         <w:tc>
           <w:tcPr>
-            <w:tcW w:type="dxa" w:w="3853"/>
+            <w:tcW w:type="dxa" w:w="4753"/>
             <w:tcMar>
               <w:top w:type="dxa" w:w="60"/>
               <w:left w:type="dxa" w:w="90"/>
@@ -589,31 +480,11 @@
             </w:r>
           </w:p>
         </w:tc>
-        <w:tc>
-          <w:tcPr>
-            <w:tcW w:type="dxa" w:w="3853"/>
-            <w:tcMar>
-              <w:top w:type="dxa" w:w="60"/>
-              <w:left w:type="dxa" w:w="90"/>
-              <w:bottom w:type="dxa" w:w="60"/>
-              <w:right w:type="dxa" w:w="90"/>
-            </w:tcMar>
-          </w:tcPr>
-          <w:p>
-            <w:r>
-              <w:rPr>
-                <w:sz w:val="18"/>
-                <w:szCs w:val="18"/>
-              </w:rPr>
-              <w:t xml:space="preserve">같음</w:t>
-            </w:r>
-          </w:p>
-        </w:tc>
       </w:tr>
       <w:tr>
         <w:tc>
           <w:tcPr>
-            <w:tcW w:type="dxa" w:w="1800"/>
+            <w:tcW w:type="dxa" w:w="4753"/>
             <w:tcMar>
               <w:top w:type="dxa" w:w="60"/>
               <w:left w:type="dxa" w:w="90"/>
@@ -633,7 +504,7 @@
         </w:tc>
         <w:tc>
           <w:tcPr>
-            <w:tcW w:type="dxa" w:w="3853"/>
+            <w:tcW w:type="dxa" w:w="4753"/>
             <w:tcMar>
               <w:top w:type="dxa" w:w="60"/>
               <w:left w:type="dxa" w:w="90"/>
@@ -665,40 +536,6 @@
             </w:r>
           </w:p>
         </w:tc>
-        <w:tc>
-          <w:tcPr>
-            <w:tcW w:type="dxa" w:w="3853"/>
-            <w:tcMar>
-              <w:top w:type="dxa" w:w="60"/>
-              <w:left w:type="dxa" w:w="90"/>
-              <w:bottom w:type="dxa" w:w="60"/>
-              <w:right w:type="dxa" w:w="90"/>
-            </w:tcMar>
-          </w:tcPr>
-          <w:p>
-            <w:r>
-              <w:rPr>
-                <w:sz w:val="18"/>
-                <w:szCs w:val="18"/>
-              </w:rPr>
-              <w:t xml:space="preserve">rtpred_compare 결과 그림(</w:t>
-            </w:r>
-            <w:r>
-              <w:rPr>
-                <w:sz w:val="18"/>
-                <w:szCs w:val="18"/>
-              </w:rPr>
-              <w:t xml:space="preserve">docs/RTpred/images/module3_result.png</w:t>
-            </w:r>
-            <w:r>
-              <w:rPr>
-                <w:sz w:val="18"/>
-                <w:szCs w:val="18"/>
-              </w:rPr>
-              <w:t xml:space="preserve">)</w:t>
-            </w:r>
-          </w:p>
-        </w:tc>
       </w:tr>
     </w:tbl>
     <w:p/>
@@ -798,7 +635,7 @@
           <w:sz w:val="24"/>
           <w:szCs w:val="24"/>
         </w:rPr>
-        <w:t xml:space="preserve">국문 (기본 모델 예측)</w:t>
+        <w:t xml:space="preserve">국문</w:t>
       </w:r>
     </w:p>
     <w:p>
@@ -806,7 +643,7 @@
         <w:spacing w:after="140"/>
       </w:pPr>
       <w:r>
-        <w:t xml:space="preserve">RTpred 기본 모델 예측 파이프라인은 화합물 구조(SMILES)만으로 액체크로마토그래피의 머무름 시간(RT)을 예측하는 분석 도구입니다. 화합물 표를 입력하면 RDKit으로 구조 특성(descriptor)을 계산하고, 이미지에 들어 있는 사전 학습 RP(역상)·HILIC 기본 모델로 화합물마다 RT를 예측합니다. 비표적 대사체 분석에서 같은 질량을 가진 후보 화합물 가운데 측정 RT와 예측 RT가 맞는 것을 고르는 데 쓸 수 있습니다.</w:t>
+        <w:t xml:space="preserve">RTpred 파이프라인은 화합물 구조(SMILES)로 액체크로마토그래피의 머무름 시간(RT)을 예측하는 분석 도구입니다. 사용자가 자기 LC 조건에서 측정한 RT 표로 분리 모드(RP, HILIC)마다 예측 모델을 학습하고(rtpred_train), 그 모델로 새 화합물의 RT를 예측하며(rtpred_predict), 학습에 쓰지 않은 화합물에서 이미지에 들어 있는 사전 학습 모델과 오차를 비교합니다(rtpred_compare). 구조는 RDKit descriptor로 바꾸고 AutoGluon 모델로 학습·예측합니다. 학습 자료가 없으면 rtpred_predict만 단독으로 실행해 사전 학습 RP·HILIC 모델로 예측할 수 있습니다. 비표적 대사체 분석에서 같은 질량을 가진 후보 화합물 가운데 측정 RT와 예측 RT가 맞는 것을 고르는 데 씁니다.</w:t>
       </w:r>
     </w:p>
     <w:p>
@@ -821,7 +658,7 @@
           <w:sz w:val="24"/>
           <w:szCs w:val="24"/>
         </w:rPr>
-        <w:t xml:space="preserve">English (default prediction)</w:t>
+        <w:t xml:space="preserve">English</w:t>
       </w:r>
     </w:p>
     <w:p>
@@ -829,53 +666,7 @@
         <w:spacing w:after="140"/>
       </w:pPr>
       <w:r>
-        <w:t xml:space="preserve">The RTpred default prediction pipeline predicts liquid chromatography retention time (RT) from compound structures (SMILES) alone. From a compound table it computes RDKit structure descriptors and predicts the RT of each compound with the pre-trained RP (reversed phase) and HILIC default models bundled in the image. In untargeted metabolomics it helps to choose, among candidates of the same mass, those whose predicted RT matches the measured RT.</w:t>
-      </w:r>
-    </w:p>
-    <w:p>
-      <w:pPr>
-        <w:spacing w:after="100" w:before="200"/>
-      </w:pPr>
-      <w:r>
-        <w:rPr>
-          <w:b/>
-          <w:bCs/>
-          <w:color w:val="3A3A3A"/>
-          <w:sz w:val="24"/>
-          <w:szCs w:val="24"/>
-        </w:rPr>
-        <w:t xml:space="preserve">국문 (사용자 모델)</w:t>
-      </w:r>
-    </w:p>
-    <w:p>
-      <w:pPr>
-        <w:spacing w:after="140"/>
-      </w:pPr>
-      <w:r>
-        <w:t xml:space="preserve">RTpred 사용자 모델 파이프라인은 사용자가 자기 LC 조건에서 측정한 RT 표로 RT 예측 모델을 직접 학습하고, 그 모델로 예측하며, 기본 모델과 성능을 비교하는 분석 도구입니다. 학습 표를 구조 단위로 train, validation, 예약 test로 나눠 AutoGluon 후보 모델을 학습하고 validation 오차로 best 모델을 고릅니다. 학습한 모델로 새 화합물의 RT를 예측하고, 학습에 쓰지 않은 예약 test 화합물에서 기본 모델과 사용자 모델의 RMSE, MAE, R²를 비교합니다.</w:t>
-      </w:r>
-    </w:p>
-    <w:p>
-      <w:pPr>
-        <w:spacing w:after="100" w:before="200"/>
-      </w:pPr>
-      <w:r>
-        <w:rPr>
-          <w:b/>
-          <w:bCs/>
-          <w:color w:val="3A3A3A"/>
-          <w:sz w:val="24"/>
-          <w:szCs w:val="24"/>
-        </w:rPr>
-        <w:t xml:space="preserve">English (user model)</w:t>
-      </w:r>
-    </w:p>
-    <w:p>
-      <w:pPr>
-        <w:spacing w:after="140"/>
-      </w:pPr>
-      <w:r>
-        <w:t xml:space="preserve">The RTpred user model pipeline trains an RT prediction model from retention times measured under the user's own LC conditions, predicts with it, and compares it with the default model. The training table is split by structure into train, validation and a reserved test, AutoGluon candidate models are trained, and the best is chosen by validation error. The trained model predicts the RT of new compounds, and the default and user models are compared by RMSE, MAE and R² on reserved test compounds that were not used in training.</w:t>
+        <w:t xml:space="preserve">The RTpred pipeline predicts liquid chromatography retention time (RT) from compound structures (SMILES). From RTs measured under the user's own LC conditions it trains a prediction model for each separation mode (RP, HILIC) (rtpred_train), predicts the RT of new compounds with it (rtpred_predict), and compares its errors with the pre-trained models in the image on compounds not used for training (rtpred_compare). Structures are turned into RDKit descriptors and AutoGluon models train and predict. Without training data, rtpred_predict can run alone with the pre-trained RP and HILIC models. In untargeted metabolomics it helps to choose, among candidates of the same mass, those whose predicted RT matches the measured RT.</w:t>
       </w:r>
     </w:p>
     <w:p>
@@ -1118,23 +909,23 @@
           <w:sz w:val="18"/>
           <w:szCs w:val="18"/>
         </w:rPr>
-        <w:t xml:space="preserve">docs/RTpred/pipeline/figures/pipeline_default.png</w:t>
-      </w:r>
-      <w:r>
-        <w:rPr>
-          <w:color w:val="8A8F99"/>
-          <w:sz w:val="18"/>
-          <w:szCs w:val="18"/>
-        </w:rPr>
-        <w:t xml:space="preserve"> (기본 모델 예측, 원본 </w:t>
-      </w:r>
-      <w:r>
-        <w:rPr>
-          <w:color w:val="8A8F99"/>
-          <w:sz w:val="18"/>
-          <w:szCs w:val="18"/>
-        </w:rPr>
-        <w:t xml:space="preserve">pipeline_default.svg</w:t>
+        <w:t xml:space="preserve">docs/RTpred/pipeline/figures/pipeline.png</w:t>
+      </w:r>
+      <w:r>
+        <w:rPr>
+          <w:color w:val="8A8F99"/>
+          <w:sz w:val="18"/>
+          <w:szCs w:val="18"/>
+        </w:rPr>
+        <w:t xml:space="preserve"> (원본 </w:t>
+      </w:r>
+      <w:r>
+        <w:rPr>
+          <w:color w:val="8A8F99"/>
+          <w:sz w:val="18"/>
+          <w:szCs w:val="18"/>
+        </w:rPr>
+        <w:t xml:space="preserve">pipeline.svg</w:t>
       </w:r>
       <w:r>
         <w:rPr>
@@ -1153,7 +944,7 @@
       <w:r>
         <w:drawing>
           <wp:inline distT="0" distB="0" distL="0" distR="0">
-            <wp:extent cx="5715000" cy="2419350"/>
+            <wp:extent cx="5715000" cy="4114800"/>
             <wp:effectExtent t="0" r="0" b="0" l="0"/>
             <wp:docPr id="1" name="" descr="" title=""/>
             <wp:cNvGraphicFramePr>
@@ -1178,7 +969,7 @@
                   <pic:spPr bwMode="auto">
                     <a:xfrm>
                       <a:off x="0" y="0"/>
-                      <a:ext cx="5715000" cy="2419350"/>
+                      <a:ext cx="5715000" cy="4114800"/>
                     </a:xfrm>
                     <a:prstGeom prst="rect">
                       <a:avLst/>
@@ -1211,6 +1002,89 @@
           <w:sz w:val="18"/>
           <w:szCs w:val="18"/>
         </w:rPr>
+        <w:t xml:space="preserve">등록 메모: 서울대 흐름도(docs/RTpred/images/pipeline_flow.png)는 "예측은 사용자 학습과 무관"으로 그려져 있습니다. 서울대 답변에 따라 예측 모듈에 학습 모델 입력(model_dir)을 더했으므로 노선도는 새로 그렸습니다.</w:t>
+      </w:r>
+    </w:p>
+    <w:p>
+      <w:pPr>
+        <w:spacing w:after="100" w:before="200"/>
+      </w:pPr>
+      <w:r>
+        <w:rPr>
+          <w:b/>
+          <w:bCs/>
+          <w:color w:val="3A3A3A"/>
+          <w:sz w:val="24"/>
+          <w:szCs w:val="24"/>
+        </w:rPr>
+        <w:t xml:space="preserve">대체 텍스트 (alt)</w:t>
+      </w:r>
+    </w:p>
+    <w:p>
+      <w:pPr>
+        <w:pStyle w:val="ListParagraph"/>
+        <w:numPr>
+          <w:ilvl w:val="0"/>
+          <w:numId w:val="2"/>
+        </w:numPr>
+        <w:spacing w:after="80"/>
+      </w:pPr>
+      <w:r>
+        <w:t xml:space="preserve">국문: RTpred 흐름도. 측정 RT 표로 rtpred_train이 RP·HILIC 모델을 학습하고, 학습 결과가 rtpred_predict(새 화합물 예측)와 rtpred_compare(예약 test로 사전 학습 모델과 비교)로 각각 이어짐. rtpred_predict는 사전 학습 모델만으로도 실행됨.</w:t>
+      </w:r>
+    </w:p>
+    <w:p>
+      <w:pPr>
+        <w:pStyle w:val="ListParagraph"/>
+        <w:numPr>
+          <w:ilvl w:val="0"/>
+          <w:numId w:val="2"/>
+        </w:numPr>
+        <w:spacing w:after="80"/>
+      </w:pPr>
+      <w:r>
+        <w:t xml:space="preserve">English: RTpred workflow: rtpred_train learns RP and HILIC models from a measured RT table, and its output feeds rtpred_predict (prediction of new compounds) and rtpred_compare (comparison with the pre-trained models on the reserved test); rtpred_predict also runs with the pre-trained models alone.</w:t>
+      </w:r>
+    </w:p>
+    <w:p>
+      <w:pPr>
+        <w:pBdr>
+          <w:bottom w:val="single" w:color="32549C" w:sz="8" w:space="4"/>
+        </w:pBdr>
+        <w:spacing w:after="160" w:before="360"/>
+      </w:pPr>
+      <w:r>
+        <w:rPr>
+          <w:rFonts w:ascii="GmarketSans" w:cs="GmarketSans" w:eastAsia="GmarketSans" w:hAnsi="GmarketSans"/>
+          <w:b/>
+          <w:bCs/>
+          <w:color w:val="32549C"/>
+          <w:sz w:val="30"/>
+          <w:szCs w:val="30"/>
+        </w:rPr>
+        <w:t xml:space="preserve">4. 분석 개념 / Analysis concept</w:t>
+      </w:r>
+    </w:p>
+    <w:p>
+      <w:pPr>
+        <w:spacing w:after="120"/>
+      </w:pPr>
+      <w:r>
+        <w:rPr>
+          <w:b/>
+          <w:bCs/>
+          <w:color w:val="B0B0B0"/>
+          <w:sz w:val="18"/>
+          <w:szCs w:val="18"/>
+        </w:rPr>
+        <w:t xml:space="preserve">[내부 메모 · 붙여 넣지 마세요] </w:t>
+      </w:r>
+      <w:r>
+        <w:rPr>
+          <w:color w:val="8A8F99"/>
+          <w:sz w:val="18"/>
+          <w:szCs w:val="18"/>
+        </w:rPr>
         <w:t xml:space="preserve">그림: </w:t>
       </w:r>
       <w:r>
@@ -1219,23 +1093,23 @@
           <w:sz w:val="18"/>
           <w:szCs w:val="18"/>
         </w:rPr>
-        <w:t xml:space="preserve">docs/RTpred/pipeline/figures/pipeline_user_model.png</w:t>
-      </w:r>
-      <w:r>
-        <w:rPr>
-          <w:color w:val="8A8F99"/>
-          <w:sz w:val="18"/>
-          <w:szCs w:val="18"/>
-        </w:rPr>
-        <w:t xml:space="preserve"> (사용자 모델, 원본 </w:t>
-      </w:r>
-      <w:r>
-        <w:rPr>
-          <w:color w:val="8A8F99"/>
-          <w:sz w:val="18"/>
-          <w:szCs w:val="18"/>
-        </w:rPr>
-        <w:t xml:space="preserve">pipeline_user_model.svg</w:t>
+        <w:t xml:space="preserve">docs/RTpred/pipeline/figures/concept.png</w:t>
+      </w:r>
+      <w:r>
+        <w:rPr>
+          <w:color w:val="8A8F99"/>
+          <w:sz w:val="18"/>
+          <w:szCs w:val="18"/>
+        </w:rPr>
+        <w:t xml:space="preserve"> (원본 </w:t>
+      </w:r>
+      <w:r>
+        <w:rPr>
+          <w:color w:val="8A8F99"/>
+          <w:sz w:val="18"/>
+          <w:szCs w:val="18"/>
+        </w:rPr>
+        <w:t xml:space="preserve">concept.svg</w:t>
       </w:r>
       <w:r>
         <w:rPr>
@@ -1254,7 +1128,7 @@
       <w:r>
         <w:drawing>
           <wp:inline distT="0" distB="0" distL="0" distR="0">
-            <wp:extent cx="5715000" cy="4114800"/>
+            <wp:extent cx="5715000" cy="2543175"/>
             <wp:effectExtent t="0" r="0" b="0" l="0"/>
             <wp:docPr id="2" name="" descr="" title=""/>
             <wp:cNvGraphicFramePr>
@@ -1279,7 +1153,7 @@
                   <pic:spPr bwMode="auto">
                     <a:xfrm>
                       <a:off x="0" y="0"/>
-                      <a:ext cx="5715000" cy="4114800"/>
+                      <a:ext cx="5715000" cy="2543175"/>
                     </a:xfrm>
                     <a:prstGeom prst="rect">
                       <a:avLst/>
@@ -1294,25 +1168,62 @@
     </w:p>
     <w:p>
       <w:pPr>
-        <w:spacing w:after="120"/>
-      </w:pPr>
-      <w:r>
-        <w:rPr>
-          <w:b/>
-          <w:bCs/>
-          <w:color w:val="B0B0B0"/>
-          <w:sz w:val="18"/>
-          <w:szCs w:val="18"/>
-        </w:rPr>
-        <w:t xml:space="preserve">[내부 메모 · 붙여 넣지 마세요] </w:t>
-      </w:r>
-      <w:r>
-        <w:rPr>
-          <w:color w:val="8A8F99"/>
-          <w:sz w:val="18"/>
-          <w:szCs w:val="18"/>
-        </w:rPr>
-        <w:t xml:space="preserve">등록 메모: 서울대 흐름도(docs/RTpred/images/pipeline_flow.png)는 "예측은 사용자 학습과 무관"으로 그려져 있습니다. 서울대 답변에 따라 예측 모듈에 학습 모델 입력(model_dir)을 더했으므로 노선도는 새로 그렸습니다.</w:t>
+        <w:spacing w:after="100" w:before="200"/>
+      </w:pPr>
+      <w:r>
+        <w:rPr>
+          <w:b/>
+          <w:bCs/>
+          <w:color w:val="3A3A3A"/>
+          <w:sz w:val="24"/>
+          <w:szCs w:val="24"/>
+        </w:rPr>
+        <w:t xml:space="preserve">국문 (그림 설명)</w:t>
+      </w:r>
+    </w:p>
+    <w:p>
+      <w:pPr>
+        <w:spacing w:after="140"/>
+      </w:pPr>
+      <w:r>
+        <w:rPr>
+          <w:b/>
+          <w:bCs/>
+        </w:rPr>
+        <w:t xml:space="preserve">그림. 구조로 예측한 머무름 시간으로 대사체 후보 거르기.</w:t>
+      </w:r>
+      <w:r>
+        <w:t xml:space="preserve"> (A) 화합물 구조(SMILES)를 RDKit 구조 특성(질량, 극성(logP), 고리 수, 수소결합 주개 등)으로 바꾸고, 학습된 AutoGluon 앙상블 모델(기본 모델 또는 사용자 모델)로 머무름 시간(RT)을 예측합니다. 측정 RT가 있으면 ΔRT(측정 - 예측)를 함께 계산합니다. (B) LC-MS에서 측정한 피크 하나에 같은 질량의 후보 구조가 여러 개 있을 때, 예측 RT가 측정 피크 주변 범위(초록 음영) 안에 드는 후보(초록)는 남기고 벗어나는 후보(빨강)는 뺍니다. RT, 범위, 후보는 모식적인 값입니다(측정 피크 RT 5.2).</w:t>
+      </w:r>
+    </w:p>
+    <w:p>
+      <w:pPr>
+        <w:spacing w:after="100" w:before="200"/>
+      </w:pPr>
+      <w:r>
+        <w:rPr>
+          <w:b/>
+          <w:bCs/>
+          <w:color w:val="3A3A3A"/>
+          <w:sz w:val="24"/>
+          <w:szCs w:val="24"/>
+        </w:rPr>
+        <w:t xml:space="preserve">English (figure legend)</w:t>
+      </w:r>
+    </w:p>
+    <w:p>
+      <w:pPr>
+        <w:spacing w:after="140"/>
+      </w:pPr>
+      <w:r>
+        <w:rPr>
+          <w:b/>
+          <w:bCs/>
+        </w:rPr>
+        <w:t xml:space="preserve">Figure. Filtering metabolite candidates with retention times predicted from structure.</w:t>
+      </w:r>
+      <w:r>
+        <w:t xml:space="preserve"> (A) Compound structures (SMILES) are turned into RDKit descriptors (mass, polarity (logP), ring count, hydrogen-bond donors and so on), and a trained AutoGluon ensemble (default or user model) predicts the retention time (RT); with a measured RT, ΔRT (measured - predicted) is also computed. (B) When several candidate structures share the mass of one LC-MS peak, candidates whose predicted RT falls within a window around the measured peak (green shading) are kept (green) and the others are dropped (red). RTs, the window and the candidates are schematic (measured peak RT 5.2).</w:t>
       </w:r>
     </w:p>
     <w:p>
@@ -1340,7 +1251,7 @@
         <w:spacing w:after="80"/>
       </w:pPr>
       <w:r>
-        <w:t xml:space="preserve">국문(기본 모델 예측): RTpred 기본 모델 예측 흐름도. 화합물 표(SMILES)가 이미지 안 기본 RP·HILIC 모델과 함께 rtpred_predict로 들어가 예측표와 그림, 보고서가 만들어짐.</w:t>
+        <w:t xml:space="preserve">국문: RTpred 개념도. 구조에서 descriptor와 모델을 거쳐 RT를 예측하는 과정과, 예측 RT 범위로 같은 질량의 후보 화합물을 거르는 예를 보여 줌.</w:t>
       </w:r>
     </w:p>
     <w:p>
@@ -1353,52 +1264,30 @@
         <w:spacing w:after="80"/>
       </w:pPr>
       <w:r>
-        <w:t xml:space="preserve">English (default prediction): RTpred default prediction workflow: a compound table (SMILES) goes into rtpred_predict with the bundled RP and HILIC models, producing a prediction table, plots and a report.</w:t>
-      </w:r>
-    </w:p>
-    <w:p>
-      <w:pPr>
-        <w:pStyle w:val="ListParagraph"/>
-        <w:numPr>
-          <w:ilvl w:val="0"/>
-          <w:numId w:val="2"/>
-        </w:numPr>
-        <w:spacing w:after="80"/>
-      </w:pPr>
-      <w:r>
-        <w:t xml:space="preserve">국문(사용자 모델): RTpred 사용자 모델 흐름도. 측정 RT 표로 rtpred_train이 모델을 학습하고, 학습 결과 폴더가 rtpred_predict(새 화합물 예측)와 rtpred_compare(예약 test로 기본 모델과 비교)로 각각 이어짐.</w:t>
-      </w:r>
-    </w:p>
-    <w:p>
-      <w:pPr>
-        <w:pStyle w:val="ListParagraph"/>
-        <w:numPr>
-          <w:ilvl w:val="0"/>
-          <w:numId w:val="2"/>
-        </w:numPr>
-        <w:spacing w:after="80"/>
-      </w:pPr>
-      <w:r>
-        <w:t xml:space="preserve">English (user model): RTpred user model workflow: rtpred_train learns a model from a measured RT table, and its output folder feeds rtpred_predict (prediction of new compounds) and rtpred_compare (comparison with the default model on the reserved test).</w:t>
-      </w:r>
-    </w:p>
-    <w:p>
-      <w:pPr>
-        <w:pBdr>
-          <w:bottom w:val="single" w:color="32549C" w:sz="8" w:space="4"/>
-        </w:pBdr>
-        <w:spacing w:after="160" w:before="360"/>
-      </w:pPr>
-      <w:r>
-        <w:rPr>
-          <w:rFonts w:ascii="GmarketSans" w:cs="GmarketSans" w:eastAsia="GmarketSans" w:hAnsi="GmarketSans"/>
-          <w:b/>
-          <w:bCs/>
-          <w:color w:val="32549C"/>
-          <w:sz w:val="30"/>
-          <w:szCs w:val="30"/>
-        </w:rPr>
-        <w:t xml:space="preserve">4. 분석 개념 / Analysis concept</w:t>
+        <w:t xml:space="preserve">English: RTpred concept: RT prediction from structure through descriptors and a model, and filtering of same-mass candidates by the predicted RT window.</w:t>
+      </w:r>
+    </w:p>
+    <w:p>
+      <w:pPr>
+        <w:spacing w:after="100" w:before="200"/>
+      </w:pPr>
+      <w:r>
+        <w:rPr>
+          <w:b/>
+          <w:bCs/>
+          <w:color w:val="3A3A3A"/>
+          <w:sz w:val="24"/>
+          <w:szCs w:val="24"/>
+        </w:rPr>
+        <w:t xml:space="preserve">출처 / Reference</w:t>
+      </w:r>
+    </w:p>
+    <w:p>
+      <w:pPr>
+        <w:spacing w:after="140"/>
+      </w:pPr>
+      <w:r>
+        <w:t xml:space="preserve">직접 작성한 모식도(외부 그림 사용 안 함)</w:t>
       </w:r>
     </w:p>
     <w:p>
@@ -1429,23 +1318,23 @@
           <w:sz w:val="18"/>
           <w:szCs w:val="18"/>
         </w:rPr>
-        <w:t xml:space="preserve">docs/RTpred/pipeline/figures/concept.png</w:t>
-      </w:r>
-      <w:r>
-        <w:rPr>
-          <w:color w:val="8A8F99"/>
-          <w:sz w:val="18"/>
-          <w:szCs w:val="18"/>
-        </w:rPr>
-        <w:t xml:space="preserve"> (원본 </w:t>
-      </w:r>
-      <w:r>
-        <w:rPr>
-          <w:color w:val="8A8F99"/>
-          <w:sz w:val="18"/>
-          <w:szCs w:val="18"/>
-        </w:rPr>
-        <w:t xml:space="preserve">concept.svg</w:t>
+        <w:t xml:space="preserve">docs/RTpred/pipeline/figures/concept_2.png</w:t>
+      </w:r>
+      <w:r>
+        <w:rPr>
+          <w:color w:val="8A8F99"/>
+          <w:sz w:val="18"/>
+          <w:szCs w:val="18"/>
+        </w:rPr>
+        <w:t xml:space="preserve"> (그림 2, 원본 </w:t>
+      </w:r>
+      <w:r>
+        <w:rPr>
+          <w:color w:val="8A8F99"/>
+          <w:sz w:val="18"/>
+          <w:szCs w:val="18"/>
+        </w:rPr>
+        <w:t xml:space="preserve">concept_2.svg</w:t>
       </w:r>
       <w:r>
         <w:rPr>
@@ -1464,7 +1353,7 @@
       <w:r>
         <w:drawing>
           <wp:inline distT="0" distB="0" distL="0" distR="0">
-            <wp:extent cx="5715000" cy="2543175"/>
+            <wp:extent cx="5715000" cy="2362200"/>
             <wp:effectExtent t="0" r="0" b="0" l="0"/>
             <wp:docPr id="3" name="" descr="" title=""/>
             <wp:cNvGraphicFramePr>
@@ -1489,231 +1378,6 @@
                   <pic:spPr bwMode="auto">
                     <a:xfrm>
                       <a:off x="0" y="0"/>
-                      <a:ext cx="5715000" cy="2543175"/>
-                    </a:xfrm>
-                    <a:prstGeom prst="rect">
-                      <a:avLst/>
-                    </a:prstGeom>
-                  </pic:spPr>
-                </pic:pic>
-              </a:graphicData>
-            </a:graphic>
-          </wp:inline>
-        </w:drawing>
-      </w:r>
-    </w:p>
-    <w:p>
-      <w:pPr>
-        <w:spacing w:after="100" w:before="200"/>
-      </w:pPr>
-      <w:r>
-        <w:rPr>
-          <w:b/>
-          <w:bCs/>
-          <w:color w:val="3A3A3A"/>
-          <w:sz w:val="24"/>
-          <w:szCs w:val="24"/>
-        </w:rPr>
-        <w:t xml:space="preserve">국문 (그림 설명)</w:t>
-      </w:r>
-    </w:p>
-    <w:p>
-      <w:pPr>
-        <w:spacing w:after="140"/>
-      </w:pPr>
-      <w:r>
-        <w:rPr>
-          <w:b/>
-          <w:bCs/>
-        </w:rPr>
-        <w:t xml:space="preserve">그림. 구조로 예측한 머무름 시간으로 대사체 후보 거르기.</w:t>
-      </w:r>
-      <w:r>
-        <w:t xml:space="preserve"> (A) 화합물 구조(SMILES)를 RDKit 구조 특성(질량, 극성(logP), 고리 수, 수소결합 주개 등)으로 바꾸고, 학습된 AutoGluon 앙상블 모델(기본 모델 또는 사용자 모델)로 머무름 시간(RT)을 예측합니다. 측정 RT가 있으면 ΔRT(측정 - 예측)를 함께 계산합니다. (B) LC-MS에서 측정한 피크 하나에 같은 질량의 후보 구조가 여러 개 있을 때, 예측 RT가 측정 피크 주변 범위(초록 음영) 안에 드는 후보(초록)는 남기고 벗어나는 후보(빨강)는 뺍니다. RT, 범위, 후보는 모식적인 값입니다(측정 피크 RT 5.2).</w:t>
-      </w:r>
-    </w:p>
-    <w:p>
-      <w:pPr>
-        <w:spacing w:after="100" w:before="200"/>
-      </w:pPr>
-      <w:r>
-        <w:rPr>
-          <w:b/>
-          <w:bCs/>
-          <w:color w:val="3A3A3A"/>
-          <w:sz w:val="24"/>
-          <w:szCs w:val="24"/>
-        </w:rPr>
-        <w:t xml:space="preserve">English (figure legend)</w:t>
-      </w:r>
-    </w:p>
-    <w:p>
-      <w:pPr>
-        <w:spacing w:after="140"/>
-      </w:pPr>
-      <w:r>
-        <w:rPr>
-          <w:b/>
-          <w:bCs/>
-        </w:rPr>
-        <w:t xml:space="preserve">Figure. Filtering metabolite candidates with retention times predicted from structure.</w:t>
-      </w:r>
-      <w:r>
-        <w:t xml:space="preserve"> (A) Compound structures (SMILES) are turned into RDKit descriptors (mass, polarity (logP), ring count, hydrogen-bond donors and so on), and a trained AutoGluon ensemble (default or user model) predicts the retention time (RT); with a measured RT, ΔRT (measured - predicted) is also computed. (B) When several candidate structures share the mass of one LC-MS peak, candidates whose predicted RT falls within a window around the measured peak (green shading) are kept (green) and the others are dropped (red). RTs, the window and the candidates are schematic (measured peak RT 5.2).</w:t>
-      </w:r>
-    </w:p>
-    <w:p>
-      <w:pPr>
-        <w:spacing w:after="100" w:before="200"/>
-      </w:pPr>
-      <w:r>
-        <w:rPr>
-          <w:b/>
-          <w:bCs/>
-          <w:color w:val="3A3A3A"/>
-          <w:sz w:val="24"/>
-          <w:szCs w:val="24"/>
-        </w:rPr>
-        <w:t xml:space="preserve">대체 텍스트 (alt)</w:t>
-      </w:r>
-    </w:p>
-    <w:p>
-      <w:pPr>
-        <w:pStyle w:val="ListParagraph"/>
-        <w:numPr>
-          <w:ilvl w:val="0"/>
-          <w:numId w:val="2"/>
-        </w:numPr>
-        <w:spacing w:after="80"/>
-      </w:pPr>
-      <w:r>
-        <w:t xml:space="preserve">국문: RTpred 개념도. 구조에서 descriptor와 모델을 거쳐 RT를 예측하는 과정과, 예측 RT 범위로 같은 질량의 후보 화합물을 거르는 예를 보여 줌.</w:t>
-      </w:r>
-    </w:p>
-    <w:p>
-      <w:pPr>
-        <w:pStyle w:val="ListParagraph"/>
-        <w:numPr>
-          <w:ilvl w:val="0"/>
-          <w:numId w:val="2"/>
-        </w:numPr>
-        <w:spacing w:after="80"/>
-      </w:pPr>
-      <w:r>
-        <w:t xml:space="preserve">English: RTpred concept: RT prediction from structure through descriptors and a model, and filtering of same-mass candidates by the predicted RT window.</w:t>
-      </w:r>
-    </w:p>
-    <w:p>
-      <w:pPr>
-        <w:spacing w:after="100" w:before="200"/>
-      </w:pPr>
-      <w:r>
-        <w:rPr>
-          <w:b/>
-          <w:bCs/>
-          <w:color w:val="3A3A3A"/>
-          <w:sz w:val="24"/>
-          <w:szCs w:val="24"/>
-        </w:rPr>
-        <w:t xml:space="preserve">출처 / Reference</w:t>
-      </w:r>
-    </w:p>
-    <w:p>
-      <w:pPr>
-        <w:spacing w:after="140"/>
-      </w:pPr>
-      <w:r>
-        <w:t xml:space="preserve">직접 작성한 모식도(외부 그림 사용 안 함)</w:t>
-      </w:r>
-    </w:p>
-    <w:p>
-      <w:pPr>
-        <w:spacing w:after="120"/>
-      </w:pPr>
-      <w:r>
-        <w:rPr>
-          <w:b/>
-          <w:bCs/>
-          <w:color w:val="B0B0B0"/>
-          <w:sz w:val="18"/>
-          <w:szCs w:val="18"/>
-        </w:rPr>
-        <w:t xml:space="preserve">[내부 메모 · 붙여 넣지 마세요] </w:t>
-      </w:r>
-      <w:r>
-        <w:rPr>
-          <w:color w:val="8A8F99"/>
-          <w:sz w:val="18"/>
-          <w:szCs w:val="18"/>
-        </w:rPr>
-        <w:t xml:space="preserve">그림: </w:t>
-      </w:r>
-      <w:r>
-        <w:rPr>
-          <w:color w:val="8A8F99"/>
-          <w:sz w:val="18"/>
-          <w:szCs w:val="18"/>
-        </w:rPr>
-        <w:t xml:space="preserve">docs/RTpred/pipeline/figures/concept_2.png</w:t>
-      </w:r>
-      <w:r>
-        <w:rPr>
-          <w:color w:val="8A8F99"/>
-          <w:sz w:val="18"/>
-          <w:szCs w:val="18"/>
-        </w:rPr>
-        <w:t xml:space="preserve"> (그림 2, 원본 </w:t>
-      </w:r>
-      <w:r>
-        <w:rPr>
-          <w:color w:val="8A8F99"/>
-          <w:sz w:val="18"/>
-          <w:szCs w:val="18"/>
-        </w:rPr>
-        <w:t xml:space="preserve">concept_2.svg</w:t>
-      </w:r>
-      <w:r>
-        <w:rPr>
-          <w:color w:val="8A8F99"/>
-          <w:sz w:val="18"/>
-          <w:szCs w:val="18"/>
-        </w:rPr>
-        <w:t xml:space="preserve">)</w:t>
-      </w:r>
-    </w:p>
-    <w:p>
-      <w:pPr>
-        <w:spacing w:after="120" w:before="120"/>
-        <w:jc w:val="center"/>
-      </w:pPr>
-      <w:r>
-        <w:drawing>
-          <wp:inline distT="0" distB="0" distL="0" distR="0">
-            <wp:extent cx="5715000" cy="2362200"/>
-            <wp:effectExtent t="0" r="0" b="0" l="0"/>
-            <wp:docPr id="4" name="" descr="" title=""/>
-            <wp:cNvGraphicFramePr>
-              <a:graphicFrameLocks xmlns:a="http://schemas.openxmlformats.org/drawingml/2006/main" noChangeAspect="1"/>
-            </wp:cNvGraphicFramePr>
-            <a:graphic xmlns:a="http://schemas.openxmlformats.org/drawingml/2006/main">
-              <a:graphicData uri="http://schemas.openxmlformats.org/drawingml/2006/picture">
-                <pic:pic xmlns:pic="http://schemas.openxmlformats.org/drawingml/2006/picture">
-                  <pic:nvPicPr>
-                    <pic:cNvPr id="0" name="" descr=""/>
-                    <pic:cNvPicPr>
-                      <a:picLocks noChangeAspect="1" noChangeArrowheads="1"/>
-                    </pic:cNvPicPr>
-                  </pic:nvPicPr>
-                  <pic:blipFill>
-                    <a:blip r:embed="rId10" cstate="none"/>
-                    <a:srcRect/>
-                    <a:stretch>
-                      <a:fillRect/>
-                    </a:stretch>
-                  </pic:blipFill>
-                  <pic:spPr bwMode="auto">
-                    <a:xfrm>
-                      <a:off x="0" y="0"/>
                       <a:ext cx="5715000" cy="2362200"/>
                     </a:xfrm>
                     <a:prstGeom prst="rect">
@@ -1909,28 +1573,10 @@
           <w:b/>
           <w:bCs/>
         </w:rPr>
-        <w:t xml:space="preserve">입력은 화합물 표(CSV 또는 XLSX)입니다.</w:t>
-      </w:r>
-      <w:r>
-        <w:t xml:space="preserve"> 한 행이 화합물 하나이며 </w:t>
-      </w:r>
-      <w:r>
-        <w:t xml:space="preserve">SMILES</w:t>
-      </w:r>
-      <w:r>
-        <w:t xml:space="preserve"> 열이 필요합니다. LC-MS raw 파일이나 샘플 그룹 정보는 필요하지 않습니다. CSV는 UTF-8, 첫 행이 헤더이고 소수점은 </w:t>
-      </w:r>
-      <w:r>
-        <w:t xml:space="preserve">.</w:t>
-      </w:r>
-      <w:r>
-        <w:t xml:space="preserve">입니다. 예전 </w:t>
-      </w:r>
-      <w:r>
-        <w:t xml:space="preserve">.xls</w:t>
-      </w:r>
-      <w:r>
-        <w:t xml:space="preserve">는 지원하지 않습니다.</w:t>
+        <w:t xml:space="preserve">학습 자료가 없으면 rtpred_predict만 실행해 주세요.</w:t>
+      </w:r>
+      <w:r>
+        <w:t xml:space="preserve"> 측정 RT 자료가 없거나 내 LC 조건의 모델이 필요 없으면, 파이프라인 대신 rtpred_predict 모듈만 단독으로 실행하고 model_dir을 비워 두면 이미지에 들어 있는 사전 학습 RP·HILIC 모델로 예측합니다. 파이프라인은 rtpred_train으로 내 조건의 모델을 만들 때 씁니다.</w:t>
       </w:r>
     </w:p>
     <w:p>
@@ -1947,16 +1593,28 @@
           <w:b/>
           <w:bCs/>
         </w:rPr>
-        <w:t xml:space="preserve">분리 모드는 RP와 HILIC이며, 입력 표의 model_type 열(행마다 RP 또는 HILIC)로 정합니다.</w:t>
-      </w:r>
-      <w:r>
-        <w:t xml:space="preserve"> 세 모듈 모두 이 열이 필요하고, 한 표에 두 모드를 섞을 수 있습니다. 학습은 모드마다 따로 모델을 만들고, 사용자 모델로 예측하면 행마다 그 모드의 모델을 씁니다. 학습하지 않은 모드의 행은 예측하지 않고 결과에 </w:t>
-      </w:r>
-      <w:r>
-        <w:t xml:space="preserve">no_trained_model</w:t>
-      </w:r>
-      <w:r>
-        <w:t xml:space="preserve">로 표시합니다.</w:t>
+        <w:t xml:space="preserve">입력은 화합물 표(CSV 또는 XLSX)입니다.</w:t>
+      </w:r>
+      <w:r>
+        <w:t xml:space="preserve"> 한 행이 화합물 하나이며 </w:t>
+      </w:r>
+      <w:r>
+        <w:t xml:space="preserve">SMILES</w:t>
+      </w:r>
+      <w:r>
+        <w:t xml:space="preserve"> 열이 필요합니다. LC-MS raw 파일이나 샘플 그룹 정보는 필요하지 않습니다. CSV는 UTF-8, 첫 행이 헤더이고 소수점은 </w:t>
+      </w:r>
+      <w:r>
+        <w:t xml:space="preserve">.</w:t>
+      </w:r>
+      <w:r>
+        <w:t xml:space="preserve">입니다. 예전 </w:t>
+      </w:r>
+      <w:r>
+        <w:t xml:space="preserve">.xls</w:t>
+      </w:r>
+      <w:r>
+        <w:t xml:space="preserve">는 지원하지 않습니다.</w:t>
       </w:r>
     </w:p>
     <w:p>
@@ -1973,10 +1631,16 @@
           <w:b/>
           <w:bCs/>
         </w:rPr>
-        <w:t xml:space="preserve">사용자 모델은 같은 LC 조건과 RT 단위로 측정한 자료로 학습해 주세요.</w:t>
-      </w:r>
-      <w:r>
-        <w:t xml:space="preserve"> 컬럼, 이동상, gradient가 섞이면 어느 조건에도 맞지 않는 모델이 됩니다. 모드마다 정제 후 25행·서로 다른 구조 15개 이상이 필요합니다.</w:t>
+        <w:t xml:space="preserve">분리 모드는 RP와 HILIC이며, 입력 표의 model_type 열(행마다 RP 또는 HILIC)로 정합니다.</w:t>
+      </w:r>
+      <w:r>
+        <w:t xml:space="preserve"> 세 모듈 모두 이 열이 필요하고, 한 표에 두 모드를 섞을 수 있습니다. 학습은 모드마다 따로 모델을 만들고, 사용자 모델로 예측하면 행마다 그 모드의 모델을 씁니다. 학습하지 않은 모드의 행은 예측하지 않고 결과에 </w:t>
+      </w:r>
+      <w:r>
+        <w:t xml:space="preserve">no_trained_model</w:t>
+      </w:r>
+      <w:r>
+        <w:t xml:space="preserve">로 표시합니다.</w:t>
       </w:r>
     </w:p>
     <w:p>
@@ -1993,16 +1657,10 @@
           <w:b/>
           <w:bCs/>
         </w:rPr>
-        <w:t xml:space="preserve">성능 비교에는 학습에 쓰지 않은 화합물을 써 주세요.</w:t>
-      </w:r>
-      <w:r>
-        <w:t xml:space="preserve"> 학습 결과의 </w:t>
-      </w:r>
-      <w:r>
-        <w:t xml:space="preserve">reserved_test.csv</w:t>
-      </w:r>
-      <w:r>
-        <w:t xml:space="preserve">가 가장 안전합니다. 사용자 모델의 학습·validation 구조와 겹치면 데이터 누수로 멈춥니다.</w:t>
+        <w:t xml:space="preserve">사용자 모델은 같은 LC 조건과 RT 단위로 측정한 자료로 학습해 주세요.</w:t>
+      </w:r>
+      <w:r>
+        <w:t xml:space="preserve"> 컬럼, 이동상, gradient가 섞이면 어느 조건에도 맞지 않는 모델이 됩니다. 모드마다 정제 후 25행·서로 다른 구조 15개 이상이 필요합니다.</w:t>
       </w:r>
     </w:p>
     <w:p>
@@ -2019,10 +1677,16 @@
           <w:b/>
           <w:bCs/>
         </w:rPr>
-        <w:t xml:space="preserve">기본 모델의 RT 단위는 분(min)입니다.</w:t>
-      </w:r>
-      <w:r>
-        <w:t xml:space="preserve"> 학습 조건(컬럼, 이동상, gradient)은 제공 자료에서 확인되지 않았으므로, 실측 RT와 비교할 때와 기본·사용자 모델을 비교할 때는 조건 차이를 감안해 주세요. 비교는 같은 모드끼리만 합니다.</w:t>
+        <w:t xml:space="preserve">성능 비교에는 학습에 쓰지 않은 화합물을 써 주세요.</w:t>
+      </w:r>
+      <w:r>
+        <w:t xml:space="preserve"> 학습 결과의 </w:t>
+      </w:r>
+      <w:r>
+        <w:t xml:space="preserve">reserved_test.csv</w:t>
+      </w:r>
+      <w:r>
+        <w:t xml:space="preserve">가 가장 안전합니다. 사용자 모델의 학습·validation 구조와 겹치면 데이터 누수로 멈춥니다.</w:t>
       </w:r>
     </w:p>
     <w:p>
@@ -2039,10 +1703,10 @@
           <w:b/>
           <w:bCs/>
         </w:rPr>
-        <w:t xml:space="preserve">잘못된 SMILES는 지우지 않고 결과에 사유와 함께 남깁니다.</w:t>
-      </w:r>
-      <w:r>
-        <w:t xml:space="preserve"> 오류가 아니라 입력 데이터의 결과입니다.</w:t>
+        <w:t xml:space="preserve">기본 모델의 RT 단위는 분(min)입니다.</w:t>
+      </w:r>
+      <w:r>
+        <w:t xml:space="preserve"> 학습 조건(컬럼, 이동상, gradient)은 제공 자료에서 확인되지 않았으므로, 실측 RT와 비교할 때와 기본·사용자 모델을 비교할 때는 조건 차이를 감안해 주세요. 비교는 같은 모드끼리만 합니다.</w:t>
       </w:r>
     </w:p>
     <w:p>
@@ -2059,6 +1723,26 @@
           <w:b/>
           <w:bCs/>
         </w:rPr>
+        <w:t xml:space="preserve">잘못된 SMILES는 지우지 않고 결과에 사유와 함께 남깁니다.</w:t>
+      </w:r>
+      <w:r>
+        <w:t xml:space="preserve"> 오류가 아니라 입력 데이터의 결과입니다.</w:t>
+      </w:r>
+    </w:p>
+    <w:p>
+      <w:pPr>
+        <w:pStyle w:val="ListParagraph"/>
+        <w:numPr>
+          <w:ilvl w:val="0"/>
+          <w:numId w:val="3"/>
+        </w:numPr>
+        <w:spacing w:after="100"/>
+      </w:pPr>
+      <w:r>
+        <w:rPr>
+          <w:b/>
+          <w:bCs/>
+        </w:rPr>
         <w:t xml:space="preserve">모든 분석은 인터넷과 GPU 없이 CPU로 수행됩니다.</w:t>
       </w:r>
       <w:r>
@@ -2078,6 +1762,26 @@
           <w:szCs w:val="24"/>
         </w:rPr>
         <w:t xml:space="preserve">English</w:t>
+      </w:r>
+    </w:p>
+    <w:p>
+      <w:pPr>
+        <w:pStyle w:val="ListParagraph"/>
+        <w:numPr>
+          <w:ilvl w:val="0"/>
+          <w:numId w:val="4"/>
+        </w:numPr>
+        <w:spacing w:after="100"/>
+      </w:pPr>
+      <w:r>
+        <w:rPr>
+          <w:b/>
+          <w:bCs/>
+        </w:rPr>
+        <w:t xml:space="preserve">Without training data, run rtpred_predict alone.</w:t>
+      </w:r>
+      <w:r>
+        <w:t xml:space="preserve"> If you have no measured RTs or do not need a model for your own LC conditions, run only the rtpred_predict module with model_dir empty; it predicts with the pre-trained RP and HILIC models in the image. Use the pipeline to build models for your own conditions with rtpred_train.</w:t>
       </w:r>
     </w:p>
     <w:p>

</xml_diff>

<commit_message>
RTpred pipeline content: add the subtitle (Korean and English)
Adapted from the developers' suggested subtitle to the current terms
(pre-trained models) and flow (train, predict, compare). Word file and the
2026-10-23 release folder rebuilt.

Co-Authored-By: Claude Opus 5.5 <noreply@anthropic.com>
</commit_message>
<xml_diff>
--- a/docs/RTpred/pipeline/Portal_Content.docx
+++ b/docs/RTpred/pipeline/Portal_Content.docx
@@ -267,6 +267,90 @@
                 <w:szCs w:val="18"/>
               </w:rPr>
               <w:t xml:space="preserve">RTpred</w:t>
+            </w:r>
+          </w:p>
+        </w:tc>
+      </w:tr>
+      <w:tr>
+        <w:tc>
+          <w:tcPr>
+            <w:tcW w:type="dxa" w:w="4753"/>
+            <w:tcMar>
+              <w:top w:type="dxa" w:w="60"/>
+              <w:left w:type="dxa" w:w="90"/>
+              <w:bottom w:type="dxa" w:w="60"/>
+              <w:right w:type="dxa" w:w="90"/>
+            </w:tcMar>
+          </w:tcPr>
+          <w:p>
+            <w:r>
+              <w:rPr>
+                <w:sz w:val="18"/>
+                <w:szCs w:val="18"/>
+              </w:rPr>
+              <w:t xml:space="preserve">서브 타이틀(국문)</w:t>
+            </w:r>
+          </w:p>
+        </w:tc>
+        <w:tc>
+          <w:tcPr>
+            <w:tcW w:type="dxa" w:w="4753"/>
+            <w:tcMar>
+              <w:top w:type="dxa" w:w="60"/>
+              <w:left w:type="dxa" w:w="90"/>
+              <w:bottom w:type="dxa" w:w="60"/>
+              <w:right w:type="dxa" w:w="90"/>
+            </w:tcMar>
+          </w:tcPr>
+          <w:p>
+            <w:r>
+              <w:rPr>
+                <w:sz w:val="18"/>
+                <w:szCs w:val="18"/>
+              </w:rPr>
+              <w:t xml:space="preserve">화합물 구조로 LC 머무름 시간을 예측하고, 내 실험 자료로 모델을 학습해 사전 학습 모델과 성능을 비교하는 분석 도구</w:t>
+            </w:r>
+          </w:p>
+        </w:tc>
+      </w:tr>
+      <w:tr>
+        <w:tc>
+          <w:tcPr>
+            <w:tcW w:type="dxa" w:w="4753"/>
+            <w:tcMar>
+              <w:top w:type="dxa" w:w="60"/>
+              <w:left w:type="dxa" w:w="90"/>
+              <w:bottom w:type="dxa" w:w="60"/>
+              <w:right w:type="dxa" w:w="90"/>
+            </w:tcMar>
+          </w:tcPr>
+          <w:p>
+            <w:r>
+              <w:rPr>
+                <w:sz w:val="18"/>
+                <w:szCs w:val="18"/>
+              </w:rPr>
+              <w:t xml:space="preserve">서브 타이틀(영문)</w:t>
+            </w:r>
+          </w:p>
+        </w:tc>
+        <w:tc>
+          <w:tcPr>
+            <w:tcW w:type="dxa" w:w="4753"/>
+            <w:tcMar>
+              <w:top w:type="dxa" w:w="60"/>
+              <w:left w:type="dxa" w:w="90"/>
+              <w:bottom w:type="dxa" w:w="60"/>
+              <w:right w:type="dxa" w:w="90"/>
+            </w:tcMar>
+          </w:tcPr>
+          <w:p>
+            <w:r>
+              <w:rPr>
+                <w:sz w:val="18"/>
+                <w:szCs w:val="18"/>
+              </w:rPr>
+              <w:t xml:space="preserve">Retention time prediction from compound structures, with user model training and comparison against the pre-trained models</w:t>
             </w:r>
           </w:p>
         </w:tc>
@@ -601,7 +685,7 @@
         <w:t xml:space="preserve">CONTENT_KO.md</w:t>
       </w:r>
       <w:r>
-        <w:t xml:space="preserve"> 1~5).</w:t>
+        <w:t xml:space="preserve"> 1~5). 서브 타이틀은 이 제안을 지금 용어(사전 학습 모델)와 흐름(학습 → 예측 → 비교)에 맞게 다듬었습니다.</w:t>
       </w:r>
     </w:p>
     <w:p>

</xml_diff>

<commit_message>
RTpred pipeline: concept figure is Xie et al. 2025 Fig. 1 unmodified
The drawn concept figure showed candidates filtered by predicted RT around a
peak, a step RTpred does not perform. The pipeline page now uses the QSRR
principle figure of Xie et al., J Pharm Anal 2025, Fig. 1 as published
(CC BY 4.0, publisher high-resolution image), with a legend mapping its
steps to rtpred_train, rtpred_predict and rtpred_compare, and the full
source line. The redrawn version of the same figure is no longer used.
Word file, portal images (pipeline/concept.png) and the 2026-10-23 release
folder (not yet deployed) rebuilt; release scripts unchanged.

Co-Authored-By: Claude Opus 5.5 <noreply@anthropic.com>
</commit_message>
<xml_diff>
--- a/docs/RTpred/pipeline/Portal_Content.docx
+++ b/docs/RTpred/pipeline/Portal_Content.docx
@@ -1177,31 +1177,7 @@
           <w:sz w:val="18"/>
           <w:szCs w:val="18"/>
         </w:rPr>
-        <w:t xml:space="preserve">docs/RTpred/pipeline/figures/concept.png</w:t>
-      </w:r>
-      <w:r>
-        <w:rPr>
-          <w:color w:val="8A8F99"/>
-          <w:sz w:val="18"/>
-          <w:szCs w:val="18"/>
-        </w:rPr>
-        <w:t xml:space="preserve"> (원본 </w:t>
-      </w:r>
-      <w:r>
-        <w:rPr>
-          <w:color w:val="8A8F99"/>
-          <w:sz w:val="18"/>
-          <w:szCs w:val="18"/>
-        </w:rPr>
-        <w:t xml:space="preserve">concept.svg</w:t>
-      </w:r>
-      <w:r>
-        <w:rPr>
-          <w:color w:val="8A8F99"/>
-          <w:sz w:val="18"/>
-          <w:szCs w:val="18"/>
-        </w:rPr>
-        <w:t xml:space="preserve">)</w:t>
+        <w:t xml:space="preserve">docs/RTpred/pipeline/figures/concept_xie2025_fig1.png</w:t>
       </w:r>
     </w:p>
     <w:p>
@@ -1212,7 +1188,7 @@
       <w:r>
         <w:drawing>
           <wp:inline distT="0" distB="0" distL="0" distR="0">
-            <wp:extent cx="5715000" cy="2543175"/>
+            <wp:extent cx="5715000" cy="3095625"/>
             <wp:effectExtent t="0" r="0" b="0" l="0"/>
             <wp:docPr id="2" name="" descr="" title=""/>
             <wp:cNvGraphicFramePr>
@@ -1237,7 +1213,7 @@
                   <pic:spPr bwMode="auto">
                     <a:xfrm>
                       <a:off x="0" y="0"/>
-                      <a:ext cx="5715000" cy="2543175"/>
+                      <a:ext cx="5715000" cy="3095625"/>
                     </a:xfrm>
                     <a:prstGeom prst="rect">
                       <a:avLst/>
@@ -1252,6 +1228,45 @@
     </w:p>
     <w:p>
       <w:pPr>
+        <w:spacing w:after="120"/>
+      </w:pPr>
+      <w:r>
+        <w:rPr>
+          <w:b/>
+          <w:bCs/>
+          <w:color w:val="B0B0B0"/>
+          <w:sz w:val="18"/>
+          <w:szCs w:val="18"/>
+        </w:rPr>
+        <w:t xml:space="preserve">[내부 메모 · 붙여 넣지 마세요] </w:t>
+      </w:r>
+      <w:r>
+        <w:rPr>
+          <w:color w:val="8A8F99"/>
+          <w:sz w:val="18"/>
+          <w:szCs w:val="18"/>
+        </w:rPr>
+        <w:t xml:space="preserve">등록 메모: 논문 그림을 수정하지 않고 그대로 씁니다(CC BY 4.0, 출판사 고해상도 원본 3091×1676). 예전 직접 그린 개념도(</w:t>
+      </w:r>
+      <w:r>
+        <w:rPr>
+          <w:color w:val="8A8F99"/>
+          <w:sz w:val="18"/>
+          <w:szCs w:val="18"/>
+        </w:rPr>
+        <w:t xml:space="preserve">concept.png</w:t>
+      </w:r>
+      <w:r>
+        <w:rPr>
+          <w:color w:val="8A8F99"/>
+          <w:sz w:val="18"/>
+          <w:szCs w:val="18"/>
+        </w:rPr>
+        <w:t xml:space="preserve">, 같은 질량 후보를 예측 RT로 거르는 그림)는 RTpred에 없는 단계로 오해할 수 있어 쓰지 않습니다.</w:t>
+      </w:r>
+    </w:p>
+    <w:p>
+      <w:pPr>
         <w:spacing w:after="100" w:before="200"/>
       </w:pPr>
       <w:r>
@@ -1274,10 +1289,10 @@
           <w:b/>
           <w:bCs/>
         </w:rPr>
-        <w:t xml:space="preserve">그림. 구조로 예측한 머무름 시간으로 대사체 후보 거르기.</w:t>
-      </w:r>
-      <w:r>
-        <w:t xml:space="preserve"> (A) 화합물 구조(SMILES)를 RDKit 구조 특성(질량, 극성(logP), 고리 수, 수소결합 주개 등)으로 바꾸고, 학습된 AutoGluon 앙상블 모델(기본 모델 또는 사용자 모델)로 머무름 시간(RT)을 예측합니다. 측정 RT가 있으면 ΔRT(측정 - 예측)를 함께 계산합니다. (B) LC-MS에서 측정한 피크 하나에 같은 질량의 후보 구조가 여러 개 있을 때, 예측 RT가 측정 피크 주변 범위(초록 음영) 안에 드는 후보(초록)는 남기고 벗어나는 후보(빨강)는 뺍니다. RT, 범위, 후보는 모식적인 값입니다(측정 피크 RT 5.2).</w:t>
+        <w:t xml:space="preserve">그림. 구조로 머무름 시간을 예측하는 원리(QSRR).</w:t>
+      </w:r>
+      <w:r>
+        <w:t xml:space="preserve"> (A) 구조를 아는 화합물들의 머무름 시간(RT)을 LC로 측정해 모읍니다. (B) 구조(SMILES)를 RDKit 등으로 분자 descriptor(logP, TPSA, 수소결합 받개 수 등)로 바꿉니다. (C) 자료를 학습용과 시험용으로 나누고, descriptor와 RT의 관계를 머신러닝 모델로 학습합니다. (D) 교차 검증과 새 자료를 쓴 외부 검증으로 모델을 평가합니다. (E) 예측 RT와 측정 RT를 비교해 정확도를 확인하고, 새 구조의 RT를 예측합니다. RTpred에서는 rtpred_train이 A~D(RDKit descriptor, AutoGluon, 분리 모드마다 모델 하나)를, rtpred_predict가 새 화합물의 예측을, rtpred_compare가 학습에 쓰지 않은 화합물로 E의 비교를 맡습니다. 이미지에 들어 있는 사전 학습 모델도 같은 방식으로 만들었습니다. 출처: Xie 외, J Pharm Anal 2025, Fig. 1(CC BY 4.0).</w:t>
       </w:r>
     </w:p>
     <w:p>
@@ -1304,10 +1319,10 @@
           <w:b/>
           <w:bCs/>
         </w:rPr>
-        <w:t xml:space="preserve">Figure. Filtering metabolite candidates with retention times predicted from structure.</w:t>
-      </w:r>
-      <w:r>
-        <w:t xml:space="preserve"> (A) Compound structures (SMILES) are turned into RDKit descriptors (mass, polarity (logP), ring count, hydrogen-bond donors and so on), and a trained AutoGluon ensemble (default or user model) predicts the retention time (RT); with a measured RT, ΔRT (measured - predicted) is also computed. (B) When several candidate structures share the mass of one LC-MS peak, candidates whose predicted RT falls within a window around the measured peak (green shading) are kept (green) and the others are dropped (red). RTs, the window and the candidates are schematic (measured peak RT 5.2).</w:t>
+        <w:t xml:space="preserve">Figure. The principle of predicting retention time from structure (QSRR).</w:t>
+      </w:r>
+      <w:r>
+        <w:t xml:space="preserve"> (A) Retention times (RT) of compounds with known structures are measured by LC and collected. (B) Structures (SMILES) are converted into molecular descriptors (logP, TPSA, hydrogen-bond acceptors and so on) with tools such as RDKit. (C) The data are split into training and test sets, and a machine learning model learns the relation between descriptors and RT. (D) The model is evaluated by cross-validation and external validation on new data. (E) Predicted and measured RTs are compared to check accuracy, and the model predicts the RT of new structures. In RTpred, rtpred_train covers A-D (RDKit descriptors, AutoGluon, one model per separation mode), rtpred_predict predicts new compounds, and rtpred_compare performs the comparison in E on compounds not used for training; the pre-trained models in the image were built the same way. Source: Xie et al., J Pharm Anal 2025, Fig. 1 (CC BY 4.0).</w:t>
       </w:r>
     </w:p>
     <w:p>
@@ -1335,7 +1350,7 @@
         <w:spacing w:after="80"/>
       </w:pPr>
       <w:r>
-        <w:t xml:space="preserve">국문: RTpred 개념도. 구조에서 descriptor와 모델을 거쳐 RT를 예측하는 과정과, 예측 RT 범위로 같은 질량의 후보 화합물을 거르는 예를 보여 줌.</w:t>
+        <w:t xml:space="preserve">국문: QSRR 원리 그림. 화합물 구조와 크로마토그램(측정 RT), SMILES와 분자 descriptor, 학습·시험 자료와 모델, 교차·외부 검증, 예측 RT 대 측정 RT 산점도의 다섯 패널.</w:t>
       </w:r>
     </w:p>
     <w:p>
@@ -1348,7 +1363,7 @@
         <w:spacing w:after="80"/>
       </w:pPr>
       <w:r>
-        <w:t xml:space="preserve">English: RTpred concept: RT prediction from structure through descriptors and a model, and filtering of same-mass candidates by the predicted RT window.</w:t>
+        <w:t xml:space="preserve">English: QSRR principle: structures and a chromatogram (measured RT), SMILES and molecular descriptors, training and test data with a model, cross- and external validation, and a predicted-versus-experimental RT plot.</w:t>
       </w:r>
     </w:p>
     <w:p>
@@ -1371,231 +1386,6 @@
         <w:spacing w:after="140"/>
       </w:pPr>
       <w:r>
-        <w:t xml:space="preserve">직접 작성한 모식도(외부 그림 사용 안 함)</w:t>
-      </w:r>
-    </w:p>
-    <w:p>
-      <w:pPr>
-        <w:spacing w:after="120"/>
-      </w:pPr>
-      <w:r>
-        <w:rPr>
-          <w:b/>
-          <w:bCs/>
-          <w:color w:val="B0B0B0"/>
-          <w:sz w:val="18"/>
-          <w:szCs w:val="18"/>
-        </w:rPr>
-        <w:t xml:space="preserve">[내부 메모 · 붙여 넣지 마세요] </w:t>
-      </w:r>
-      <w:r>
-        <w:rPr>
-          <w:color w:val="8A8F99"/>
-          <w:sz w:val="18"/>
-          <w:szCs w:val="18"/>
-        </w:rPr>
-        <w:t xml:space="preserve">그림: </w:t>
-      </w:r>
-      <w:r>
-        <w:rPr>
-          <w:color w:val="8A8F99"/>
-          <w:sz w:val="18"/>
-          <w:szCs w:val="18"/>
-        </w:rPr>
-        <w:t xml:space="preserve">docs/RTpred/pipeline/figures/concept_2.png</w:t>
-      </w:r>
-      <w:r>
-        <w:rPr>
-          <w:color w:val="8A8F99"/>
-          <w:sz w:val="18"/>
-          <w:szCs w:val="18"/>
-        </w:rPr>
-        <w:t xml:space="preserve"> (그림 2, 원본 </w:t>
-      </w:r>
-      <w:r>
-        <w:rPr>
-          <w:color w:val="8A8F99"/>
-          <w:sz w:val="18"/>
-          <w:szCs w:val="18"/>
-        </w:rPr>
-        <w:t xml:space="preserve">concept_2.svg</w:t>
-      </w:r>
-      <w:r>
-        <w:rPr>
-          <w:color w:val="8A8F99"/>
-          <w:sz w:val="18"/>
-          <w:szCs w:val="18"/>
-        </w:rPr>
-        <w:t xml:space="preserve">)</w:t>
-      </w:r>
-    </w:p>
-    <w:p>
-      <w:pPr>
-        <w:spacing w:after="120" w:before="120"/>
-        <w:jc w:val="center"/>
-      </w:pPr>
-      <w:r>
-        <w:drawing>
-          <wp:inline distT="0" distB="0" distL="0" distR="0">
-            <wp:extent cx="5715000" cy="2362200"/>
-            <wp:effectExtent t="0" r="0" b="0" l="0"/>
-            <wp:docPr id="3" name="" descr="" title=""/>
-            <wp:cNvGraphicFramePr>
-              <a:graphicFrameLocks xmlns:a="http://schemas.openxmlformats.org/drawingml/2006/main" noChangeAspect="1"/>
-            </wp:cNvGraphicFramePr>
-            <a:graphic xmlns:a="http://schemas.openxmlformats.org/drawingml/2006/main">
-              <a:graphicData uri="http://schemas.openxmlformats.org/drawingml/2006/picture">
-                <pic:pic xmlns:pic="http://schemas.openxmlformats.org/drawingml/2006/picture">
-                  <pic:nvPicPr>
-                    <pic:cNvPr id="0" name="" descr=""/>
-                    <pic:cNvPicPr>
-                      <a:picLocks noChangeAspect="1" noChangeArrowheads="1"/>
-                    </pic:cNvPicPr>
-                  </pic:nvPicPr>
-                  <pic:blipFill>
-                    <a:blip r:embed="rId9" cstate="none"/>
-                    <a:srcRect/>
-                    <a:stretch>
-                      <a:fillRect/>
-                    </a:stretch>
-                  </pic:blipFill>
-                  <pic:spPr bwMode="auto">
-                    <a:xfrm>
-                      <a:off x="0" y="0"/>
-                      <a:ext cx="5715000" cy="2362200"/>
-                    </a:xfrm>
-                    <a:prstGeom prst="rect">
-                      <a:avLst/>
-                    </a:prstGeom>
-                  </pic:spPr>
-                </pic:pic>
-              </a:graphicData>
-            </a:graphic>
-          </wp:inline>
-        </w:drawing>
-      </w:r>
-    </w:p>
-    <w:p>
-      <w:pPr>
-        <w:spacing w:after="100" w:before="200"/>
-      </w:pPr>
-      <w:r>
-        <w:rPr>
-          <w:b/>
-          <w:bCs/>
-          <w:color w:val="3A3A3A"/>
-          <w:sz w:val="24"/>
-          <w:szCs w:val="24"/>
-        </w:rPr>
-        <w:t xml:space="preserve">국문 (그림 2 설명)</w:t>
-      </w:r>
-    </w:p>
-    <w:p>
-      <w:pPr>
-        <w:spacing w:after="140"/>
-      </w:pPr>
-      <w:r>
-        <w:rPr>
-          <w:b/>
-          <w:bCs/>
-        </w:rPr>
-        <w:t xml:space="preserve">그림 2. 구조로 머무름 시간을 예측하는 원리(QSRR).</w:t>
-      </w:r>
-      <w:r>
-        <w:t xml:space="preserve"> (A) 구조를 아는 화합물들의 측정 RT를 모읍니다. (B) 구조(SMILES)를 RDKit descriptor(logP, TPSA, 수소결합 받개 수 등)로 바꿉니다. (C) descriptor와 측정 RT의 관계를 머신러닝 모델로 학습하고, (D) 학습에 쓰지 않은 자료로 검증합니다. (E) 학습한 모델이 새 구조의 RT를 예측합니다. RTpred의 rtpred_train이 A~D를(AutoGluon, 모드마다 모델 하나), rtpred_predict가 E를, rtpred_compare가 떼어 둔 자료로 D와 E를 맡으며, 이미지의 사전 학습 모델도 같은 방식으로 만들었습니다. 모식도입니다. Xie 외, J Pharm Anal 2025, Fig. 1을 수정(CC BY 4.0).</w:t>
-      </w:r>
-    </w:p>
-    <w:p>
-      <w:pPr>
-        <w:spacing w:after="100" w:before="200"/>
-      </w:pPr>
-      <w:r>
-        <w:rPr>
-          <w:b/>
-          <w:bCs/>
-          <w:color w:val="3A3A3A"/>
-          <w:sz w:val="24"/>
-          <w:szCs w:val="24"/>
-        </w:rPr>
-        <w:t xml:space="preserve">English (figure 2 legend)</w:t>
-      </w:r>
-    </w:p>
-    <w:p>
-      <w:pPr>
-        <w:spacing w:after="140"/>
-      </w:pPr>
-      <w:r>
-        <w:rPr>
-          <w:b/>
-          <w:bCs/>
-        </w:rPr>
-        <w:t xml:space="preserve">Figure 2. The principle of predicting retention time from structure (QSRR).</w:t>
-      </w:r>
-      <w:r>
-        <w:t xml:space="preserve"> (A) Measured RTs of compounds with known structures are collected. (B) Structures (SMILES) are turned into RDKit descriptors (logP, TPSA, hydrogen-bond acceptors and so on). (C) A machine learning model learns the relation between descriptors and measured RT and (D) is validated on data not used for training. (E) The trained model predicts the RT of new structures. In RTpred, rtpred_train covers A-D (AutoGluon, one model per mode), rtpred_predict covers E, and rtpred_compare covers D and E on held-out data; the pre-trained models in the image were built the same way. Schematic. Adapted from Xie et al., J Pharm Anal 2025, Fig. 1 (CC BY 4.0).</w:t>
-      </w:r>
-    </w:p>
-    <w:p>
-      <w:pPr>
-        <w:spacing w:after="100" w:before="200"/>
-      </w:pPr>
-      <w:r>
-        <w:rPr>
-          <w:b/>
-          <w:bCs/>
-          <w:color w:val="3A3A3A"/>
-          <w:sz w:val="24"/>
-          <w:szCs w:val="24"/>
-        </w:rPr>
-        <w:t xml:space="preserve">대체 텍스트 (그림 2)</w:t>
-      </w:r>
-    </w:p>
-    <w:p>
-      <w:pPr>
-        <w:pStyle w:val="ListParagraph"/>
-        <w:numPr>
-          <w:ilvl w:val="0"/>
-          <w:numId w:val="2"/>
-        </w:numPr>
-        <w:spacing w:after="80"/>
-      </w:pPr>
-      <w:r>
-        <w:t xml:space="preserve">국문: QSRR 원리 흐름도. 측정 RT와 구조, 분자 descriptor, 모델 학습, 검증, RT 예측의 다섯 단계와 각 단계를 맡는 RTpred 모듈.</w:t>
-      </w:r>
-    </w:p>
-    <w:p>
-      <w:pPr>
-        <w:pStyle w:val="ListParagraph"/>
-        <w:numPr>
-          <w:ilvl w:val="0"/>
-          <w:numId w:val="2"/>
-        </w:numPr>
-        <w:spacing w:after="80"/>
-      </w:pPr>
-      <w:r>
-        <w:t xml:space="preserve">English: QSRR principle: measured RTs and structures, molecular descriptors, model training, validation and RT prediction, with the RTpred module for each step.</w:t>
-      </w:r>
-    </w:p>
-    <w:p>
-      <w:pPr>
-        <w:spacing w:after="100" w:before="200"/>
-      </w:pPr>
-      <w:r>
-        <w:rPr>
-          <w:b/>
-          <w:bCs/>
-          <w:color w:val="3A3A3A"/>
-          <w:sz w:val="24"/>
-          <w:szCs w:val="24"/>
-        </w:rPr>
-        <w:t xml:space="preserve">출처 (그림 2)</w:t>
-      </w:r>
-    </w:p>
-    <w:p>
-      <w:pPr>
-        <w:spacing w:after="140"/>
-      </w:pPr>
-      <w:r>
         <w:t xml:space="preserve">Xie J, Chen S, Zhao L, Dong X. Application of artificial intelligence to quantitative structure-retention relationship calculations in chromatography. </w:t>
       </w:r>
       <w:r>
@@ -1606,7 +1396,7 @@
         <w:t xml:space="preserve">J Pharm Anal</w:t>
       </w:r>
       <w:r>
-        <w:t xml:space="preserve"> 15, 101155 (2025). https://doi.org/10.1016/j.jpha.2024.101155, Fig. 1을 수정. CC BY 4.0 (https://creativecommons.org/licenses/by/4.0/).</w:t>
+        <w:t xml:space="preserve"> 15, 101155 (2025). https://doi.org/10.1016/j.jpha.2024.101155, Fig. 1. CC BY 4.0 (https://creativecommons.org/licenses/by/4.0/).</w:t>
       </w:r>
     </w:p>
     <w:p>

</xml_diff>

<commit_message>
RTpred pipeline: thumbnail from a run on public measured RTs
The representative image is the measured-versus-predicted panel of the
HILIC rtpred_compare result from a Codespace run on RepoRT datasets 0063
(RP, BEH C18) and 0228 (HILIC, BEH Amide), cropped without changing any
point; the registration note gives the data, licence and errors. The
module result images stay the developers' examples. Word file, portal
images and the 2026-10-23 release folder rebuilt.

Co-Authored-By: Claude Opus 5.5 <noreply@anthropic.com>
</commit_message>
<xml_diff>
--- a/docs/RTpred/pipeline/Portal_Content.docx
+++ b/docs/RTpred/pipeline/Portal_Content.docx
@@ -602,21 +602,14 @@
                 <w:sz w:val="18"/>
                 <w:szCs w:val="18"/>
               </w:rPr>
-              <w:t xml:space="preserve">rtpred_predict 결과 그림(</w:t>
+              <w:t xml:space="preserve">docs/RTpred/pipeline/figures/thumbnail.png</w:t>
             </w:r>
             <w:r>
               <w:rPr>
                 <w:sz w:val="18"/>
                 <w:szCs w:val="18"/>
               </w:rPr>
-              <w:t xml:space="preserve">docs/RTpred/images/module1_result.png</w:t>
-            </w:r>
-            <w:r>
-              <w:rPr>
-                <w:sz w:val="18"/>
-                <w:szCs w:val="18"/>
-              </w:rPr>
-              <w:t xml:space="preserve">)</w:t>
+              <w:t xml:space="preserve">: rtpred_compare 결과의 측정 RT 대 예측 RT 산점도(HILIC, 공개 실측 자료)</w:t>
             </w:r>
           </w:p>
         </w:tc>
@@ -644,6 +637,25 @@
           <w:szCs w:val="18"/>
         </w:rPr>
         <w:t xml:space="preserve">등록 메모:</w:t>
+      </w:r>
+    </w:p>
+    <w:p>
+      <w:pPr>
+        <w:pStyle w:val="ListParagraph"/>
+        <w:numPr>
+          <w:ilvl w:val="0"/>
+          <w:numId w:val="2"/>
+        </w:numPr>
+        <w:spacing w:after="80"/>
+      </w:pPr>
+      <w:r>
+        <w:t xml:space="preserve">대표 이미지(썸네일)는 공개 RT 저장소 RepoRT(Kretschmer 외, Nat Methods 2024, CC BY-SA 4.0)의 RP 데이터셋 0063(Waters ACQUITY UPLC BEH C18, 455개)과 HILIC 데이터셋 0228(Waters ACQUITY UPLC BEH Amide, 270개)을 한 표로 섞어 rtpred_train → rtpred_compare로 돌린 결과(2026-10-26, Codespace 검증 빌드)에서, HILIC </w:t>
+      </w:r>
+      <w:r>
+        <w:t xml:space="preserve">comparison.png</w:t>
+      </w:r>
+      <w:r>
+        <w:t xml:space="preserve">의 오른쪽 패널(Selected best models)을 잘라낸 것입니다. 점은 바꾸지 않았습니다. 이 평가에서 HILIC은 사전 학습 모델 RMSE 1.71분(R² 0.72), 사용자 모델 1.77분(R² 0.70), RP는 사전 학습 모델 1.97분(R² 0.12), 사용자 모델 1.22분(R² 0.66)이었습니다. 모듈의 주요 결과 이미지는 서울대 예제 그대로 둡니다.</w:t>
       </w:r>
     </w:p>
     <w:p>

</xml_diff>